<commit_message>
Merge Word edits into the source: reworked Summary and compressed Introduction
Species histories cut per author edits, with their four orphaned references
removed and the 2025 reconfirmation context moved to its point of use in
Results with its citation.
</commit_message>
<xml_diff>
--- a/paper/manuscript.docx
+++ b/paper/manuscript.docx
@@ -75,7 +75,7 @@
           <w:sz w:val="24"/>
           <w:szCs w:val="24"/>
         </w:rPr>
-        <w:t xml:space="preserve">Automated acoustic monitoring is one of the few practical ways to survey rare and cryptic birds, but it depends on software that can recognise the target species, and the global classifiers that power most such monitoring do not cover the species that need it most. Four bird species endemic to India and listed as Endangered or Critically Endangered have sound recordings in public archives, the Forest Owlet, the Banasura Laughingthrush, the Bugun Liocichla, and Jerdon's Courser, and only the Forest Owlet is recognised by BirdNET, the most widely used bird sound classifier. We gathered every public recording of these four species from the Macaulay Library and Xeno-canto, 193 unique recordings totalling approximately 125 minutes, and tested whether this material is sufficient to train reliable classifiers. Classifiers were trained on acoustic embeddings extracted with BirdNET and were always evaluated on recordings that had played no part in training or model tuning. The best classifier identified the correct species for 97.4% of recordings (95% confidence interval 94.8 to 99.5), compared with 83.4% for a conventional fine-tuned convolutional network, and its accuracy fell only to 92.2% when the test audio was degraded with noise as loud as the signal itself. Because a classifier deployed in the field must also ignore the many species it was never trained on, we further tested the system against 1,891 recordings of 28 other Indian endemic species. The plain classifier wrongly flagged 93.7% of these recordings as one of the four target species. Adding a rejection category trained on recordings of other species cut these false detections to 13.4% while still identifying 89.1% of target recordings correctly. Public archives can therefore support accurate classifiers even for birds this rare, and reliable rejection of non-target species is the main remaining requirement for field deployment.</w:t>
+        <w:t xml:space="preserve">Automated acoustic monitoring is one of the few practical ways to survey rare and cryptic birds, but it depends on software that can recognise the target species, and the global classifiers that power most such monitoring do not cover the species that need it most. Four bird species endemic to India and listed as Endangered or Critically Endangered have sound recordings in public archives, the Forest Owlet, the Banasura Laughingthrush, the Bugun Liocichla, and Jerdon's Courser, yet only the Forest Owlet is recognised by BirdNET, the most widely used bird sound classifier. We gathered every public recording of these four species from the Macaulay Library and Xeno-canto, 193 unique recordings totalling approximately 125 minutes, and tested whether this material is sufficient to train reliable classifiers. Classifiers were trained on acoustic embeddings extracted with BirdNET and were evaluated on a held-out set of recordings that had played no part in training or model tuning. The best classifier identified the correct species for 97.4% of recordings (95% confidence interval 94.8 to 99.5), and its accuracy fell only to 92.2% when the test audio was degraded with synthetic noise as loud as the original recording itself. Because a classifier deployed in the field must also ignore the many species it was never trained on, we further tested the system against 1,891 recordings of 28 other Indian endemic species. By adding a rejection category trained on recordings of other species to the model, we reduce the false positive rate to just 13.4% while still identifying 89.1% of target recordings correctly. As a result, we conclude that reliable classifiers can be developed using publicly available data to aid in the monitoring of endangered birds.</w:t>
       </w:r>
     </w:p>
     <w:p>
@@ -201,7 +201,7 @@
           <w:sz w:val="24"/>
           <w:szCs w:val="24"/>
         </w:rPr>
-        <w:t xml:space="preserve">India supports over 1,300 bird species, of which more than 75 occur nowhere else in the world (SoIB 2023). Endemic species with narrow geographic ranges are disproportionately vulnerable to habitat loss, and several Indian endemics are now assessed as Endangered or Critically Endangered on the IUCN Red List (IUCN 2025). Exactly four such species have sound recordings available in the major public archives. The Forest Owlet </w:t>
+        <w:t xml:space="preserve">India is home to over 1,300 bird species, of which more than 75 are considered endemic, occurring nowhere else in the world (SoIB 2023). Endemic species with narrow geographic ranges are disproportionately vulnerable to habitat loss, and several Indian endemics are now assessed as Endangered or Critically Endangered on the IUCN Red List (IUCN 2025). While rarely spotted in the wild, four such species have sound recordings available in the major public archives: Forest Owlet (</w:t>
       </w:r>
       <w:r>
         <w:rPr>
@@ -219,7 +219,7 @@
           <w:sz w:val="24"/>
           <w:szCs w:val="24"/>
         </w:rPr>
-        <w:t xml:space="preserve"> (Endangered) was known from seven nineteenth-century specimens until its rediscovery in 1997 and retains a small, fragmented, and declining population (Rasmussen and Collar 1998). The Banasura Laughingthrush </w:t>
+        <w:t xml:space="preserve">), Banasura Laughingthrush (</w:t>
       </w:r>
       <w:r>
         <w:rPr>
@@ -237,7 +237,7 @@
           <w:sz w:val="24"/>
           <w:szCs w:val="24"/>
         </w:rPr>
-        <w:t xml:space="preserve"> (Endangered) is confined to high-elevation shola forest patches totalling under 57 km² in the Wayanad region of the Western Ghats (Robin et al. 2017). The Bugun Liocichla </w:t>
+        <w:t xml:space="preserve">), Bugun Liocichla (</w:t>
       </w:r>
       <w:r>
         <w:rPr>
@@ -255,7 +255,7 @@
           <w:sz w:val="24"/>
           <w:szCs w:val="24"/>
         </w:rPr>
-        <w:t xml:space="preserve"> (Critically Endangered), described in 2006 from Eaglenest Wildlife Sanctuary in Arunachal Pradesh, is known from a handful of territories holding at most a few tens of individuals (Athreya 2006). Jerdon's Courser </w:t>
+        <w:t xml:space="preserve">), and Jerdon's Courser (</w:t>
       </w:r>
       <w:r>
         <w:rPr>
@@ -273,7 +273,7 @@
           <w:sz w:val="24"/>
           <w:szCs w:val="24"/>
         </w:rPr>
-        <w:t xml:space="preserve"> (Critically Endangered), rediscovered in 1986 after 86 years without a record (Bhushan 1986), went unrecorded again from 2008 until August 2025, when its call was captured by an automated recording unit at a previously unknown site (Search for Lost Birds 2025).</w:t>
+        <w:t xml:space="preserve">).</w:t>
       </w:r>
     </w:p>
     <w:p>
@@ -287,7 +287,7 @@
           <w:sz w:val="24"/>
           <w:szCs w:val="24"/>
         </w:rPr>
-        <w:t xml:space="preserve">These four species are natural candidates for passive acoustic monitoring. They are nocturnal or skulking, they occupy terrain where visual survey is difficult, and each has distinctive vocalisations. The reconfirmation of Jerdon's Courser in 2025 through an automated recorder illustrates the value of the approach directly. Acoustic monitoring at useful scales, however, requires automated identification, because continuous recorders produce far more audio than observers can review. The classifiers that currently dominate applied bioacoustics cannot provide this identification for these species. We verified that only the Forest Owlet is present in the label set of BirdNET V2.4 (Kahl et al. 2021), and the other three species therefore cannot be detected by it at any confidence threshold. Species-specific classifiers address a concrete operational gap.</w:t>
+        <w:t xml:space="preserve">These four species are natural candidates for passive acoustic monitoring. They are nocturnal or skulking, occupy terrain where visual survey is difficult, and have distinctive vocalisations. Acoustic monitoring at useful scales, however, requires automated identification, because continuous recorders produce far more audio than observers can review. The classifiers that currently dominate applied bioacoustics cannot provide this identification for these species. We verified that only the Forest Owlet is present in the label set of BirdNET V2.4 (Kahl et al. 2021), the most widely used bird song classification system, and the other three species therefore cannot be detected by it at any confidence threshold. Therefore, there exists a need for classifiers specifically trained to classify these four species.</w:t>
       </w:r>
     </w:p>
     <w:p>
@@ -301,7 +301,7 @@
           <w:sz w:val="24"/>
           <w:szCs w:val="24"/>
         </w:rPr>
-        <w:t xml:space="preserve">Because these species are so rare, data are scarce, with the complete public record ranging from 12 to 75 recordings per species, and this creates two difficulties, one in training and one in testing. Training suffers because datasets this small cannot support conventional deep networks, so we build on acoustic embeddings from a large pretrained bird sound model instead, which recent work has shown transfer to small datasets far better than training or fine-tuning conventional networks (Ghani et al. 2023). Testing suffers because a model can score highly by recognising recording conditions rather than the species itself, so we use a cross-validation design that keeps the data used for training, model selection, and final testing strictly separate.</w:t>
+        <w:t xml:space="preserve">However, training classifiers for endangered species with a limited number of recordings presents multiple methodological difficulties. The complete public record of these four species ranges from just 12 to 75 recordings per species. This creates two difficulties, one in training and one in testing. Training suffers because datasets this small cannot support conventional deep networks, so we build on acoustic embeddings from a large pretrained bird sound model instead, which recent work has shown transfer to small datasets far better than training or fine-tuning conventional networks (Ghani et al. 2023). Testing suffers because a model can score highly by recognising recording conditions rather than the species itself, so we use a cross-validation design that keeps the data used for training, model selection, and final testing strictly separate.</w:t>
       </w:r>
     </w:p>
     <w:p>
@@ -4699,7 +4699,7 @@
           <w:sz w:val="24"/>
           <w:szCs w:val="24"/>
         </w:rPr>
-        <w:t xml:space="preserve">Jerdon's Courser requires separate interpretation because its situation is a property of the archive rather than of any model. The public record of the species consists of one recording session from 2001 to 2002 (the 11 Macaulay recordings in a single catalogue block) plus one Xeno-canto recording. Under the event-level scheme the Macaulay block trains the model and the Xeno-canto recording provides the only possible test of generalisation beyond that session. This recording was classified correctly and confidently, with the probe assigning between 89% and 94% probability to Jerdon's Courser across seeds and the MIL model behaving equivalently. We checked whether the result might be trivial in the sense of the Xeno-canto file being a reprocessed copy of the Macaulay audio. The content hashes differ, and the maximum cosine similarity between its embedding and any Macaulay window is 0.69, below the maximum of 0.84 observed between different recordings within the Macaulay session itself, so the evidence is consistent with genuinely distinct audio. The conclusion must nevertheless remain limited, because a single recording cannot establish generalisation, and no evaluation design can extract more from an archive whose record of the species traces to one recording effort. Depositing the 2025 reconfirmation recordings in a public archive would multiply the available evidence, and we return to this point in the Discussion.</w:t>
+        <w:t xml:space="preserve">Jerdon's Courser requires separate interpretation because its situation is a property of the archive rather than of any model. The public record of the species consists of one recording session from 2001 to 2002 (the 11 Macaulay recordings in a single catalogue block) plus one Xeno-canto recording. Under the event-level scheme the Macaulay block trains the model and the Xeno-canto recording provides the only possible test of generalisation beyond that session. This recording was classified correctly and confidently, with the probe assigning between 89% and 94% probability to Jerdon's Courser across seeds and the MIL model behaving equivalently. We checked whether the result might be trivial in the sense of the Xeno-canto file being a reprocessed copy of the Macaulay audio. The content hashes differ, and the maximum cosine similarity between its embedding and any Macaulay window is 0.69, below the maximum of 0.84 observed between different recordings within the Macaulay session itself, so the evidence is consistent with genuinely distinct audio. The conclusion must nevertheless remain limited, because a single recording cannot establish generalisation, and no evaluation design can extract more from an archive whose record of the species traces to one recording effort. The species went unrecorded from 2008 until August 2025, when its call was captured by an automated recording unit at a previously unknown site (Search for Lost Birds 2025), and depositing those reconfirmation recordings in a public archive would multiply the available evidence. We return to this point in the Discussion.</w:t>
       </w:r>
     </w:p>
     <w:p>
@@ -5612,7 +5612,7 @@
           <w:sz w:val="24"/>
           <w:szCs w:val="24"/>
         </w:rPr>
-        <w:t xml:space="preserve">Athreya, R. (2006). A new species of Liocichla (Aves: Timaliidae) from Eaglenest Wildlife Sanctuary, Arunachal Pradesh, India. </w:t>
+        <w:t xml:space="preserve">Ghani, B., Denton, T., Kahl, S. and Klinck, H. (2023). Global birdsong embeddings enable superior transfer learning for bioacoustic classification. </w:t>
       </w:r>
       <w:r>
         <w:rPr>
@@ -5622,15 +5622,15 @@
           <w:sz w:val="24"/>
           <w:szCs w:val="24"/>
         </w:rPr>
-        <w:t xml:space="preserve">Indian Birds</w:t>
-      </w:r>
-      <w:r>
-        <w:rPr>
-          <w:rFonts w:ascii="Times New Roman" w:cs="Times New Roman" w:eastAsia="Times New Roman" w:hAnsi="Times New Roman"/>
-          <w:sz w:val="24"/>
-          <w:szCs w:val="24"/>
-        </w:rPr>
-        <w:t xml:space="preserve"> 2, 82–94.</w:t>
+        <w:t xml:space="preserve">Scientific Reports</w:t>
+      </w:r>
+      <w:r>
+        <w:rPr>
+          <w:rFonts w:ascii="Times New Roman" w:cs="Times New Roman" w:eastAsia="Times New Roman" w:hAnsi="Times New Roman"/>
+          <w:sz w:val="24"/>
+          <w:szCs w:val="24"/>
+        </w:rPr>
+        <w:t xml:space="preserve"> 13, 22876. https://doi.org/10.1038/s41598-023-49989-z.</w:t>
       </w:r>
     </w:p>
     <w:p>
@@ -5644,7 +5644,7 @@
           <w:sz w:val="24"/>
           <w:szCs w:val="24"/>
         </w:rPr>
-        <w:t xml:space="preserve">Bhushan, B. (1986). Rediscovery of the Jerdon's Courser </w:t>
+        <w:t xml:space="preserve">Ilse, M., Tomczak, J.M. and Welling, M. (2018). Attention-based deep multiple instance learning. </w:t>
       </w:r>
       <w:r>
         <w:rPr>
@@ -5654,15 +5654,29 @@
           <w:sz w:val="24"/>
           <w:szCs w:val="24"/>
         </w:rPr>
-        <w:t xml:space="preserve">Cursorius bitorquatus</w:t>
-      </w:r>
-      <w:r>
-        <w:rPr>
-          <w:rFonts w:ascii="Times New Roman" w:cs="Times New Roman" w:eastAsia="Times New Roman" w:hAnsi="Times New Roman"/>
-          <w:sz w:val="24"/>
-          <w:szCs w:val="24"/>
-        </w:rPr>
-        <w:t xml:space="preserve">. </w:t>
+        <w:t xml:space="preserve">Proceedings of the 35th International Conference on Machine Learning</w:t>
+      </w:r>
+      <w:r>
+        <w:rPr>
+          <w:rFonts w:ascii="Times New Roman" w:cs="Times New Roman" w:eastAsia="Times New Roman" w:hAnsi="Times New Roman"/>
+          <w:sz w:val="24"/>
+          <w:szCs w:val="24"/>
+        </w:rPr>
+        <w:t xml:space="preserve">, 2127–2136.</w:t>
+      </w:r>
+    </w:p>
+    <w:p>
+      <w:pPr>
+        <w:spacing w:after="160" w:line="276"/>
+        <w:jc w:val="left"/>
+      </w:pPr>
+      <w:r>
+        <w:rPr>
+          <w:rFonts w:ascii="Times New Roman" w:cs="Times New Roman" w:eastAsia="Times New Roman" w:hAnsi="Times New Roman"/>
+          <w:sz w:val="24"/>
+          <w:szCs w:val="24"/>
+        </w:rPr>
+        <w:t xml:space="preserve">IUCN (2025). </w:t>
       </w:r>
       <w:r>
         <w:rPr>
@@ -5672,15 +5686,15 @@
           <w:sz w:val="24"/>
           <w:szCs w:val="24"/>
         </w:rPr>
-        <w:t xml:space="preserve">Journal of the Bombay Natural History Society</w:t>
-      </w:r>
-      <w:r>
-        <w:rPr>
-          <w:rFonts w:ascii="Times New Roman" w:cs="Times New Roman" w:eastAsia="Times New Roman" w:hAnsi="Times New Roman"/>
-          <w:sz w:val="24"/>
-          <w:szCs w:val="24"/>
-        </w:rPr>
-        <w:t xml:space="preserve"> 83, 1–14.</w:t>
+        <w:t xml:space="preserve">The IUCN Red List of Threatened Species</w:t>
+      </w:r>
+      <w:r>
+        <w:rPr>
+          <w:rFonts w:ascii="Times New Roman" w:cs="Times New Roman" w:eastAsia="Times New Roman" w:hAnsi="Times New Roman"/>
+          <w:sz w:val="24"/>
+          <w:szCs w:val="24"/>
+        </w:rPr>
+        <w:t xml:space="preserve">. https://www.iucnredlist.org (accessed 2026).</w:t>
       </w:r>
     </w:p>
     <w:p>
@@ -5694,7 +5708,7 @@
           <w:sz w:val="24"/>
           <w:szCs w:val="24"/>
         </w:rPr>
-        <w:t xml:space="preserve">Ghani, B., Denton, T., Kahl, S. and Klinck, H. (2023). Global birdsong embeddings enable superior transfer learning for bioacoustic classification. </w:t>
+        <w:t xml:space="preserve">Jeganathan, P., Green, R.E., Bowden, C.G.R., Norris, K., Pain, D. and Rahmani, A. (2002). Use of tracking strips and automatic cameras for detecting Critically Endangered Jerdon's coursers </w:t>
       </w:r>
       <w:r>
         <w:rPr>
@@ -5704,15 +5718,33 @@
           <w:sz w:val="24"/>
           <w:szCs w:val="24"/>
         </w:rPr>
-        <w:t xml:space="preserve">Scientific Reports</w:t>
-      </w:r>
-      <w:r>
-        <w:rPr>
-          <w:rFonts w:ascii="Times New Roman" w:cs="Times New Roman" w:eastAsia="Times New Roman" w:hAnsi="Times New Roman"/>
-          <w:sz w:val="24"/>
-          <w:szCs w:val="24"/>
-        </w:rPr>
-        <w:t xml:space="preserve"> 13, 22876. https://doi.org/10.1038/s41598-023-49989-z.</w:t>
+        <w:t xml:space="preserve">Rhinoptilus bitorquatus</w:t>
+      </w:r>
+      <w:r>
+        <w:rPr>
+          <w:rFonts w:ascii="Times New Roman" w:cs="Times New Roman" w:eastAsia="Times New Roman" w:hAnsi="Times New Roman"/>
+          <w:sz w:val="24"/>
+          <w:szCs w:val="24"/>
+        </w:rPr>
+        <w:t xml:space="preserve"> in scrub jungle in Andhra Pradesh, India. </w:t>
+      </w:r>
+      <w:r>
+        <w:rPr>
+          <w:rFonts w:ascii="Times New Roman" w:cs="Times New Roman" w:eastAsia="Times New Roman" w:hAnsi="Times New Roman"/>
+          <w:i/>
+          <w:iCs/>
+          <w:sz w:val="24"/>
+          <w:szCs w:val="24"/>
+        </w:rPr>
+        <w:t xml:space="preserve">Oryx</w:t>
+      </w:r>
+      <w:r>
+        <w:rPr>
+          <w:rFonts w:ascii="Times New Roman" w:cs="Times New Roman" w:eastAsia="Times New Roman" w:hAnsi="Times New Roman"/>
+          <w:sz w:val="24"/>
+          <w:szCs w:val="24"/>
+        </w:rPr>
+        <w:t xml:space="preserve"> 36, 182–188.</w:t>
       </w:r>
     </w:p>
     <w:p>
@@ -5726,7 +5758,7 @@
           <w:sz w:val="24"/>
           <w:szCs w:val="24"/>
         </w:rPr>
-        <w:t xml:space="preserve">Ilse, M., Tomczak, J.M. and Welling, M. (2018). Attention-based deep multiple instance learning. </w:t>
+        <w:t xml:space="preserve">Kahl, S., Wood, C.M., Eibl, M. and Klinck, H. (2021). BirdNET: A deep learning solution for avian diversity monitoring. </w:t>
       </w:r>
       <w:r>
         <w:rPr>
@@ -5736,15 +5768,15 @@
           <w:sz w:val="24"/>
           <w:szCs w:val="24"/>
         </w:rPr>
-        <w:t xml:space="preserve">Proceedings of the 35th International Conference on Machine Learning</w:t>
-      </w:r>
-      <w:r>
-        <w:rPr>
-          <w:rFonts w:ascii="Times New Roman" w:cs="Times New Roman" w:eastAsia="Times New Roman" w:hAnsi="Times New Roman"/>
-          <w:sz w:val="24"/>
-          <w:szCs w:val="24"/>
-        </w:rPr>
-        <w:t xml:space="preserve">, 2127–2136.</w:t>
+        <w:t xml:space="preserve">Ecological Informatics</w:t>
+      </w:r>
+      <w:r>
+        <w:rPr>
+          <w:rFonts w:ascii="Times New Roman" w:cs="Times New Roman" w:eastAsia="Times New Roman" w:hAnsi="Times New Roman"/>
+          <w:sz w:val="24"/>
+          <w:szCs w:val="24"/>
+        </w:rPr>
+        <w:t xml:space="preserve"> 61, 101236. https://doi.org/10.1016/j.ecoinf.2021.101236.</w:t>
       </w:r>
     </w:p>
     <w:p>
@@ -5758,7 +5790,7 @@
           <w:sz w:val="24"/>
           <w:szCs w:val="24"/>
         </w:rPr>
-        <w:t xml:space="preserve">IUCN (2025). </w:t>
+        <w:t xml:space="preserve">Khosla, P., Teterwak, P., Wang, C., Sarna, A., Tian, Y., Isola, P. et al. (2020). Supervised contrastive learning. </w:t>
       </w:r>
       <w:r>
         <w:rPr>
@@ -5768,120 +5800,6 @@
           <w:sz w:val="24"/>
           <w:szCs w:val="24"/>
         </w:rPr>
-        <w:t xml:space="preserve">The IUCN Red List of Threatened Species</w:t>
-      </w:r>
-      <w:r>
-        <w:rPr>
-          <w:rFonts w:ascii="Times New Roman" w:cs="Times New Roman" w:eastAsia="Times New Roman" w:hAnsi="Times New Roman"/>
-          <w:sz w:val="24"/>
-          <w:szCs w:val="24"/>
-        </w:rPr>
-        <w:t xml:space="preserve">. https://www.iucnredlist.org (accessed 2026).</w:t>
-      </w:r>
-    </w:p>
-    <w:p>
-      <w:pPr>
-        <w:spacing w:after="160" w:line="276"/>
-        <w:jc w:val="left"/>
-      </w:pPr>
-      <w:r>
-        <w:rPr>
-          <w:rFonts w:ascii="Times New Roman" w:cs="Times New Roman" w:eastAsia="Times New Roman" w:hAnsi="Times New Roman"/>
-          <w:sz w:val="24"/>
-          <w:szCs w:val="24"/>
-        </w:rPr>
-        <w:t xml:space="preserve">Jeganathan, P., Green, R.E., Bowden, C.G.R., Norris, K., Pain, D. and Rahmani, A. (2002). Use of tracking strips and automatic cameras for detecting Critically Endangered Jerdon's coursers </w:t>
-      </w:r>
-      <w:r>
-        <w:rPr>
-          <w:rFonts w:ascii="Times New Roman" w:cs="Times New Roman" w:eastAsia="Times New Roman" w:hAnsi="Times New Roman"/>
-          <w:i/>
-          <w:iCs/>
-          <w:sz w:val="24"/>
-          <w:szCs w:val="24"/>
-        </w:rPr>
-        <w:t xml:space="preserve">Rhinoptilus bitorquatus</w:t>
-      </w:r>
-      <w:r>
-        <w:rPr>
-          <w:rFonts w:ascii="Times New Roman" w:cs="Times New Roman" w:eastAsia="Times New Roman" w:hAnsi="Times New Roman"/>
-          <w:sz w:val="24"/>
-          <w:szCs w:val="24"/>
-        </w:rPr>
-        <w:t xml:space="preserve"> in scrub jungle in Andhra Pradesh, India. </w:t>
-      </w:r>
-      <w:r>
-        <w:rPr>
-          <w:rFonts w:ascii="Times New Roman" w:cs="Times New Roman" w:eastAsia="Times New Roman" w:hAnsi="Times New Roman"/>
-          <w:i/>
-          <w:iCs/>
-          <w:sz w:val="24"/>
-          <w:szCs w:val="24"/>
-        </w:rPr>
-        <w:t xml:space="preserve">Oryx</w:t>
-      </w:r>
-      <w:r>
-        <w:rPr>
-          <w:rFonts w:ascii="Times New Roman" w:cs="Times New Roman" w:eastAsia="Times New Roman" w:hAnsi="Times New Roman"/>
-          <w:sz w:val="24"/>
-          <w:szCs w:val="24"/>
-        </w:rPr>
-        <w:t xml:space="preserve"> 36, 182–188.</w:t>
-      </w:r>
-    </w:p>
-    <w:p>
-      <w:pPr>
-        <w:spacing w:after="160" w:line="276"/>
-        <w:jc w:val="left"/>
-      </w:pPr>
-      <w:r>
-        <w:rPr>
-          <w:rFonts w:ascii="Times New Roman" w:cs="Times New Roman" w:eastAsia="Times New Roman" w:hAnsi="Times New Roman"/>
-          <w:sz w:val="24"/>
-          <w:szCs w:val="24"/>
-        </w:rPr>
-        <w:t xml:space="preserve">Kahl, S., Wood, C.M., Eibl, M. and Klinck, H. (2021). BirdNET: A deep learning solution for avian diversity monitoring. </w:t>
-      </w:r>
-      <w:r>
-        <w:rPr>
-          <w:rFonts w:ascii="Times New Roman" w:cs="Times New Roman" w:eastAsia="Times New Roman" w:hAnsi="Times New Roman"/>
-          <w:i/>
-          <w:iCs/>
-          <w:sz w:val="24"/>
-          <w:szCs w:val="24"/>
-        </w:rPr>
-        <w:t xml:space="preserve">Ecological Informatics</w:t>
-      </w:r>
-      <w:r>
-        <w:rPr>
-          <w:rFonts w:ascii="Times New Roman" w:cs="Times New Roman" w:eastAsia="Times New Roman" w:hAnsi="Times New Roman"/>
-          <w:sz w:val="24"/>
-          <w:szCs w:val="24"/>
-        </w:rPr>
-        <w:t xml:space="preserve"> 61, 101236. https://doi.org/10.1016/j.ecoinf.2021.101236.</w:t>
-      </w:r>
-    </w:p>
-    <w:p>
-      <w:pPr>
-        <w:spacing w:after="160" w:line="276"/>
-        <w:jc w:val="left"/>
-      </w:pPr>
-      <w:r>
-        <w:rPr>
-          <w:rFonts w:ascii="Times New Roman" w:cs="Times New Roman" w:eastAsia="Times New Roman" w:hAnsi="Times New Roman"/>
-          <w:sz w:val="24"/>
-          <w:szCs w:val="24"/>
-        </w:rPr>
-        <w:t xml:space="preserve">Khosla, P., Teterwak, P., Wang, C., Sarna, A., Tian, Y., Isola, P. et al. (2020). Supervised contrastive learning. </w:t>
-      </w:r>
-      <w:r>
-        <w:rPr>
-          <w:rFonts w:ascii="Times New Roman" w:cs="Times New Roman" w:eastAsia="Times New Roman" w:hAnsi="Times New Roman"/>
-          <w:i/>
-          <w:iCs/>
-          <w:sz w:val="24"/>
-          <w:szCs w:val="24"/>
-        </w:rPr>
         <w:t xml:space="preserve">Advances in Neural Information Processing Systems</w:t>
       </w:r>
       <w:r>
@@ -5891,88 +5809,6 @@
           <w:szCs w:val="24"/>
         </w:rPr>
         <w:t xml:space="preserve"> 33, 18661–18673.</w:t>
-      </w:r>
-    </w:p>
-    <w:p>
-      <w:pPr>
-        <w:spacing w:after="160" w:line="276"/>
-        <w:jc w:val="left"/>
-      </w:pPr>
-      <w:r>
-        <w:rPr>
-          <w:rFonts w:ascii="Times New Roman" w:cs="Times New Roman" w:eastAsia="Times New Roman" w:hAnsi="Times New Roman"/>
-          <w:sz w:val="24"/>
-          <w:szCs w:val="24"/>
-        </w:rPr>
-        <w:t xml:space="preserve">Rasmussen, P.C. and Collar, N.J. (1998). Identification, distribution and status of the Forest Owlet </w:t>
-      </w:r>
-      <w:r>
-        <w:rPr>
-          <w:rFonts w:ascii="Times New Roman" w:cs="Times New Roman" w:eastAsia="Times New Roman" w:hAnsi="Times New Roman"/>
-          <w:i/>
-          <w:iCs/>
-          <w:sz w:val="24"/>
-          <w:szCs w:val="24"/>
-        </w:rPr>
-        <w:t xml:space="preserve">Athene (Heteroglaux) blewitti</w:t>
-      </w:r>
-      <w:r>
-        <w:rPr>
-          <w:rFonts w:ascii="Times New Roman" w:cs="Times New Roman" w:eastAsia="Times New Roman" w:hAnsi="Times New Roman"/>
-          <w:sz w:val="24"/>
-          <w:szCs w:val="24"/>
-        </w:rPr>
-        <w:t xml:space="preserve">. </w:t>
-      </w:r>
-      <w:r>
-        <w:rPr>
-          <w:rFonts w:ascii="Times New Roman" w:cs="Times New Roman" w:eastAsia="Times New Roman" w:hAnsi="Times New Roman"/>
-          <w:i/>
-          <w:iCs/>
-          <w:sz w:val="24"/>
-          <w:szCs w:val="24"/>
-        </w:rPr>
-        <w:t xml:space="preserve">Forktail</w:t>
-      </w:r>
-      <w:r>
-        <w:rPr>
-          <w:rFonts w:ascii="Times New Roman" w:cs="Times New Roman" w:eastAsia="Times New Roman" w:hAnsi="Times New Roman"/>
-          <w:sz w:val="24"/>
-          <w:szCs w:val="24"/>
-        </w:rPr>
-        <w:t xml:space="preserve"> 14, 41–49.</w:t>
-      </w:r>
-    </w:p>
-    <w:p>
-      <w:pPr>
-        <w:spacing w:after="160" w:line="276"/>
-        <w:jc w:val="left"/>
-      </w:pPr>
-      <w:r>
-        <w:rPr>
-          <w:rFonts w:ascii="Times New Roman" w:cs="Times New Roman" w:eastAsia="Times New Roman" w:hAnsi="Times New Roman"/>
-          <w:sz w:val="24"/>
-          <w:szCs w:val="24"/>
-        </w:rPr>
-        <w:t xml:space="preserve">Robin, V.V., Vishnudas, C.K., Gupta, P., Rheindt, F.E., Hooper, D.M., Ramakrishnan, U. et al. (2017). Two new genera of songbirds represent endemic radiations from the Shola Sky Islands of the Western Ghats, India. </w:t>
-      </w:r>
-      <w:r>
-        <w:rPr>
-          <w:rFonts w:ascii="Times New Roman" w:cs="Times New Roman" w:eastAsia="Times New Roman" w:hAnsi="Times New Roman"/>
-          <w:i/>
-          <w:iCs/>
-          <w:sz w:val="24"/>
-          <w:szCs w:val="24"/>
-        </w:rPr>
-        <w:t xml:space="preserve">BMC Evolutionary Biology</w:t>
-      </w:r>
-      <w:r>
-        <w:rPr>
-          <w:rFonts w:ascii="Times New Roman" w:cs="Times New Roman" w:eastAsia="Times New Roman" w:hAnsi="Times New Roman"/>
-          <w:sz w:val="24"/>
-          <w:szCs w:val="24"/>
-        </w:rPr>
-        <w:t xml:space="preserve"> 17, 31. https://doi.org/10.1186/s12862-017-0882-6.</w:t>
       </w:r>
     </w:p>
     <w:p>

</xml_diff>

<commit_message>
Replace open-set and closed-set jargon with plain wording
</commit_message>
<xml_diff>
--- a/paper/manuscript.docx
+++ b/paper/manuscript.docx
@@ -315,7 +315,7 @@
           <w:sz w:val="24"/>
           <w:szCs w:val="24"/>
         </w:rPr>
-        <w:t xml:space="preserve">The study comprises five analyses. First, we compare three classifier families on the four-species identification task, a fine-tuned convolutional network on spectrograms representing standard practice, a lightweight classifier on frozen BirdNET embeddings, and a multiple instance learning model with attention that classifies whole recordings, in order to establish which approach the data scale actually supports. Second, we evaluate every model under two cross-validation schemes, one splitting at the level of the unique recording and a stricter one splitting at the level of the recording session, in order to measure whether performance survives when models cannot exploit any within-session similarity. Third, we test whether adapting the embedding space to Indian endemic birds through supervised contrastive learning on 28 non-target endemic species improves target discrimination. Fourth, we measure open-set behaviour, meaning the ability to reject species outside the four targets, against 1,891 recordings of the 28 non-target endemics, and we test an explicit background class as a remedy, because a deployed detector encounters far more non-target sound than target sound. Fifth, we measure robustness by degrading test audio with additive noise at controlled signal-to-noise ratios. Together with a comparison against BirdNET's own output for the one species it covers, these analyses describe both what the archives can support and what remains missing for deployment.</w:t>
+        <w:t xml:space="preserve">The study comprises five analyses. First, we compare three classifier families on the four-species identification task, a fine-tuned convolutional network on spectrograms representing standard practice, a lightweight classifier on frozen BirdNET embeddings, and a multiple instance learning model with attention that classifies whole recordings, in order to establish which approach the data scale actually supports. Second, we evaluate every model under two cross-validation schemes, one splitting at the level of the unique recording and a stricter one splitting at the level of the recording session, in order to measure whether performance survives when models cannot exploit any within-session similarity. Third, we test whether retraining the embeddings on 28 other endemic Indian species makes the four target species easier to distinguish. Fourth, we test whether the classifier can reject species it was not trained on, since a deployed detector hears far more non-target sound than target sound, by evaluating it against 1,891 recordings of the 28 non-target endemics and adding an explicit background class as a remedy. Fifth, we measure robustness by degrading test audio with additive noise at controlled signal-to-noise ratios. Together with a comparison against BirdNET's own output for the one species it covers, these analyses describe both what the archives can support and what remains missing for deployment.</w:t>
       </w:r>
     </w:p>
     <w:p>
@@ -1924,7 +1924,7 @@
           <w:sz w:val="24"/>
           <w:szCs w:val="24"/>
         </w:rPr>
-        <w:t xml:space="preserve">Open-set rejection</w:t>
+        <w:t xml:space="preserve">Rejection of non-target species</w:t>
       </w:r>
     </w:p>
     <w:p>
@@ -1938,7 +1938,7 @@
           <w:sz w:val="24"/>
           <w:szCs w:val="24"/>
         </w:rPr>
-        <w:t xml:space="preserve">A classifier restricted to four output classes will assign one of those four labels to any input, including species it has never seen, so closed-set accuracy alone does not describe field behaviour. We evaluated open-set performance in two ways. In the first, the maximum softmax probability of the closed-set probe was used as a confidence score, with the acceptance threshold calibrated only on validation data as the highest value retaining at least 95% of validation recordings. Separation between target and non-target recordings was summarised by the area under the ROC curve. In the second, a fifth background class was added to the probe. The 28 auxiliary species were split in half, with windows from 14 species (1,077 recordings) forming the background class during training and the remaining 14 species (814 recordings), which no model component had seen in any role, used to measure false acceptance. Evaluating on species held out entirely, rather than on held-out recordings of training species, measures rejection of genuinely novel sound.</w:t>
+        <w:t xml:space="preserve">A classifier restricted to four output classes will assign one of those four labels to any input, including species it has never seen, so accuracy on the four targets alone does not describe field behaviour. The ability to reject inputs from unfamiliar classes is known in the machine learning literature as open-set recognition, and we evaluated it in two ways. In the first, the four-class probe's own confidence (its maximum softmax probability) was used as the score, with the acceptance threshold calibrated only on validation data as the highest value retaining at least 95% of validation recordings. Separation between target and non-target recordings was summarised by the area under the ROC curve. In the second, a fifth background class was added to the probe. The 28 auxiliary species were split in half, with windows from 14 species (1,077 recordings) forming the background class during training and the remaining 14 species (814 recordings), which no model component had seen in any role, used to measure false acceptance. Evaluating on species held out entirely, rather than on held-out recordings of training species, measures rejection of genuinely novel sound.</w:t>
       </w:r>
     </w:p>
     <w:p>
@@ -2036,7 +2036,7 @@
           <w:sz w:val="24"/>
           <w:szCs w:val="24"/>
         </w:rPr>
-        <w:t xml:space="preserve">Closed-set identification</w:t>
+        <w:t xml:space="preserve">Identification of the four target species</w:t>
       </w:r>
     </w:p>
     <w:p>
@@ -4843,7 +4843,7 @@
           <w:sz w:val="24"/>
           <w:szCs w:val="24"/>
         </w:rPr>
-        <w:t xml:space="preserve">Open-set rejection</w:t>
+        <w:t xml:space="preserve">Rejection of non-target species</w:t>
       </w:r>
     </w:p>
     <w:p>
@@ -4857,7 +4857,7 @@
           <w:sz w:val="24"/>
           <w:szCs w:val="24"/>
         </w:rPr>
-        <w:t xml:space="preserve">Confidence thresholding on the closed-set probe separated target from non-target recordings poorly. At the validation-calibrated threshold of 0.61, which retained 97.4% of target recordings, 93.7% of the 1,891 non-target recordings were also accepted, taking the worst case over folds, and the recording-level area under the ROC curve was 0.746 (window-level AUROC 0.868 ± 0.045 for maximum softmax probability and 0.878 ± 0.065 for the energy score, mean and standard deviation over folds). Deployed as it stands, the closed-set model would produce confident false detections on most non-target species it heard.</w:t>
+        <w:t xml:space="preserve">Confidence thresholding on the four-class probe separated target from non-target recordings poorly. At the validation-calibrated threshold of 0.61, which retained 97.4% of target recordings, 93.7% of the 1,891 non-target recordings were also accepted, taking the worst case over folds, and the recording-level area under the ROC curve was 0.746 (window-level AUROC 0.868 ± 0.045 for maximum softmax probability and 0.878 ± 0.065 for the energy score, mean and standard deviation over folds). Deployed as it stands, the four-class model would produce confident false detections on most non-target species it heard.</w:t>
       </w:r>
     </w:p>
     <w:p>
@@ -4895,7 +4895,7 @@
           <w:sz w:val="24"/>
           <w:szCs w:val="24"/>
         </w:rPr>
-        <w:t xml:space="preserve"> Open-set behaviour at the recording level. MSP denotes the maximum softmax probability of the closed-set probe, with the threshold calibrated on validation data only. The background-class model is trained with 14 auxiliary species and evaluated for false acceptance on 14 entirely unseen species. Target retention counts recordings accepted for the MSP row, and recordings both accepted and correctly identified for the background-class row.</w:t>
+        <w:t xml:space="preserve"> Rejection of non-target species at the recording level. MSP denotes the maximum softmax probability of the four-class probe, with the threshold calibrated on validation data only. The background-class model is trained with 14 auxiliary species and evaluated for false acceptance on 14 entirely unseen species. Target retention counts recordings accepted for the MSP row, and recordings both accepted and correctly identified for the background-class row.</w:t>
       </w:r>
     </w:p>
     <w:tbl>
@@ -5044,7 +5044,7 @@
                 <w:sz w:val="24"/>
                 <w:szCs w:val="24"/>
               </w:rPr>
-              <w:t xml:space="preserve">MSP threshold on the closed-set probe</w:t>
+              <w:t xml:space="preserve">MSP threshold on the four-class probe</w:t>
             </w:r>
           </w:p>
         </w:tc>
@@ -5450,7 +5450,7 @@
           <w:sz w:val="24"/>
           <w:szCs w:val="24"/>
         </w:rPr>
-        <w:t xml:space="preserve">The open-set results define the boundary between a classification study and a deployable detector. A model with 97.4% closed-set accuracy accepted 93.7% of recordings of other endemic species when guarded only by a confidence threshold, and a background class trained on species held disjoint from the evaluation brought false acceptance down to 13.4% at a cost of 8.8% of target recordings. Closed-set accuracy alone therefore overstates field readiness by a wide margin, and we would encourage studies proposing classifiers for conservation use to report open-set metrics against realistic regional distractors, particularly because the auxiliary data required are typically easier to obtain than the target data.</w:t>
+        <w:t xml:space="preserve">The rejection results define the boundary between a classification study and a deployable detector. A model with 97.4% accuracy on the four target species accepted 93.7% of recordings of other endemic species when guarded only by a confidence threshold, and a background class trained on species held disjoint from the evaluation brought false acceptance down to 13.4% at a cost of 8.8% of target recordings. Accuracy on the target species alone therefore overstates field readiness by a wide margin, and we would encourage studies proposing classifiers for conservation use to report rejection performance against realistic regional distractors, particularly because the auxiliary data required are typically easier to obtain than the target data.</w:t>
       </w:r>
     </w:p>
     <w:p>
@@ -5522,7 +5522,7 @@
           <w:sz w:val="24"/>
           <w:szCs w:val="24"/>
         </w:rPr>
-        <w:t xml:space="preserve">The complete public acoustic record of the four Endangered and Critically Endangered Indian endemic birds with archived recordings supports reliable closed-set identification, with 97.4% recording-level accuracy that persists under session-level splits and degrades only mildly under heavy noise. The strongest models are small classifiers on frozen foundation model embeddings, which outperform fine-tuned networks at this data scale and remain trainable with minimal computation. Field deployment additionally requires open-set rejection, for which an explicit background class trained on regional non-target species reduced false acceptance sevenfold in species-disjoint evaluation. The manifest, splits, code, and results accompanying this paper allow every reported number to be reproduced from the public archives.</w:t>
+        <w:t xml:space="preserve">The complete public acoustic record of the four Endangered and Critically Endangered Indian endemic birds with archived recordings supports reliable identification, with 97.4% recording-level accuracy that persists under session-level splits and degrades only mildly under heavy noise. The strongest models are small classifiers on frozen foundation model embeddings, which outperform fine-tuned networks at this data scale and remain trainable with minimal computation. Field deployment additionally requires rejection of species outside the target set, for which an explicit background class trained on regional non-target species reduced false acceptance sevenfold in species-disjoint evaluation. The manifest, splits, code, and results accompanying this paper allow every reported number to be reproduced from the public archives.</w:t>
       </w:r>
     </w:p>
     <w:p>

</xml_diff>

<commit_message>
Expand open-set and robustness methods under technical headings, merge Word edits
</commit_message>
<xml_diff>
--- a/paper/manuscript.docx
+++ b/paper/manuscript.docx
@@ -1623,7 +1623,7 @@
           <w:sz w:val="24"/>
           <w:szCs w:val="24"/>
         </w:rPr>
-        <w:t xml:space="preserve">The unit of splitting is never the window. All windows of a recording share that recording's partition in every experiment reported in this paper.</w:t>
+        <w:t xml:space="preserve">The primary train-test splitting method is stratified five-fold cross-validation over unique recordings. Within each outer fold, the recordings outside the test fold were divided further, again at the recording level and stratified by species, into a training set of approximately 80% and a validation set of approximately 20%. Early stopping and every other model selection decision used only this inner validation set, and each outer test fold was evaluated exactly once after all decisions were frozen. Across the five folds every recording is tested exactly once, so the reported metrics cover all 193 recordings. We chose cross-validation rather than a single held-out test set because, with 12 recordings of Jerdon's Courser, a single test set would either starve training or leave test metrics for that species resting on two or three files, whereas cross-validated held-out folds evaluate every recording exactly once while preserving independence.</w:t>
       </w:r>
     </w:p>
     <w:p>
@@ -1637,7 +1637,7 @@
           <w:sz w:val="24"/>
           <w:szCs w:val="24"/>
         </w:rPr>
-        <w:t xml:space="preserve">The primary scheme is stratified five-fold cross-validation over unique recordings. Within each outer fold, the recordings outside the test fold were divided further, again at the recording level and stratified by species, into a training set of approximately 80% and a validation set of approximately 20%. Early stopping and every other model selection decision used only this inner validation set, and each outer test fold was evaluated exactly once after all decisions were frozen. Across the five folds every recording is tested exactly once, so the reported metrics cover all 193 recordings. We chose cross-validation rather than a single held-out test set because, with 12 recordings of Jerdon's Courser, a single test set would either starve training or leave test metrics for that species resting on two or three files, whereas cross-validated held-out folds evaluate every recording exactly once while preserving independence. Per-class support is reported in unique recordings throughout.</w:t>
+        <w:t xml:space="preserve">The stricter session-level train-test splitting method is constructed identically except that the unit assigned to folds is the recording event rather than the individual recording, so no two recordings from the same session can appear on opposite sides of any partition. This scheme tests generalisation across recording sessions rather than only across files. For Jerdon's Courser the scheme is constrained by the data, because the species has exactly two events, the Macaulay block and a single Xeno-canto recording. We assigned the Macaulay block to training, which leaves the Xeno-canto recording as a one-recording cross-source test.</w:t>
       </w:r>
     </w:p>
     <w:p>
@@ -1651,21 +1651,7 @@
           <w:sz w:val="24"/>
           <w:szCs w:val="24"/>
         </w:rPr>
-        <w:t xml:space="preserve">The stricter event-level scheme is constructed identically except that the unit assigned to folds is the recording event rather than the individual recording, so no two recordings from the same session can appear on opposite sides of any partition. This scheme tests generalisation across recording sessions rather than only across files. For Jerdon's Courser the scheme is constrained by the data, because the species has exactly two events, the Macaulay block and a single Xeno-canto recording. We assigned the Macaulay block to training, which leaves the Xeno-canto recording as a one-recording cross-source test, the only test of generalisation beyond the known session that the archive permits.</w:t>
-      </w:r>
-    </w:p>
-    <w:p>
-      <w:pPr>
-        <w:spacing w:after="160" w:line="276"/>
-        <w:jc w:val="left"/>
-      </w:pPr>
-      <w:r>
-        <w:rPr>
-          <w:rFonts w:ascii="Times New Roman" w:cs="Times New Roman" w:eastAsia="Times New Roman" w:hAnsi="Times New Roman"/>
-          <w:sz w:val="24"/>
-          <w:szCs w:val="24"/>
-        </w:rPr>
-        <w:t xml:space="preserve">Every experiment was repeated with three random seeds, and we report seed-averaged predictions together with the spread across seeds. Class imbalance was handled with inverse-frequency loss weighting rather than duplication. Uncertainty on accuracy and macro-F1 is reported as 95% percentile bootstrap confidence intervals over recordings, and paired model comparisons use exact McNemar tests on recording-level outcomes. The serialised splits, together with their generating seed, are distributed with the code.</w:t>
+        <w:t xml:space="preserve">Every experiment was repeated with three random seeds, and we report seed-averaged predictions together with the spread across seeds. Class imbalance was handled with inverse-frequency loss weighting. Uncertainty on accuracy and macro-F1 is reported as 95% percentile bootstrap confidence intervals over recordings, and paired model comparisons use exact McNemar tests on recording-level outcomes. The serialised splits, together with their generating seed, are distributed with the code.</w:t>
       </w:r>
     </w:p>
     <w:p>
@@ -1753,7 +1739,7 @@
           <w:sz w:val="24"/>
           <w:szCs w:val="24"/>
         </w:rPr>
-        <w:t xml:space="preserve">Finally, we evaluated equal-weight soft-vote ensembles of the models above. The member probabilities are averaged without any tuned weights, so ensembling introduces no additional model selection.</w:t>
+        <w:t xml:space="preserve">Finally, we evaluated equal-weight soft-vote ensembles of the models above.</w:t>
       </w:r>
     </w:p>
     <w:p>
@@ -1771,7 +1757,7 @@
           <w:sz w:val="24"/>
           <w:szCs w:val="24"/>
         </w:rPr>
-        <w:t xml:space="preserve">Rejection of non-target species</w:t>
+        <w:t xml:space="preserve">Open-set recognition</w:t>
       </w:r>
     </w:p>
     <w:p>
@@ -1785,7 +1771,35 @@
           <w:sz w:val="24"/>
           <w:szCs w:val="24"/>
         </w:rPr>
-        <w:t xml:space="preserve">A classifier restricted to four output classes will assign one of those four labels to any input, including species it has never seen, so accuracy on the four targets alone does not describe field behaviour. The ability to reject inputs from unfamiliar classes is known in the machine learning literature as open-set recognition, and we evaluated it in two ways. In the first, the four-class probe's own confidence (its maximum softmax probability) was used as the score, with the acceptance threshold calibrated only on validation data as the highest value retaining at least 95% of validation recordings. Separation between target and non-target recordings was summarised by the area under the ROC curve. In the second, a fifth background class was added to the probe. The 28 auxiliary species were split in half, with windows from 14 species (1,077 recordings) forming the background class during training and the remaining 14 species (814 recordings), which no model component had seen in any role, used to measure false acceptance. Evaluating on species held out entirely, rather than on held-out recordings of training species, measures rejection of genuinely novel sound.</w:t>
+        <w:t xml:space="preserve">A classifier with four output classes will assign one of those four labels to every input it receives, including recordings of species it has never seen. A model can therefore be highly accurate on the four target species and still be unusable in the field, where most sounds come from other species. The problem of detecting that an input belongs to none of the trained classes is called open-set recognition, and we evaluated two approaches to it, using the 1,891 recordings of the 28 auxiliary species as realistic non-target material.</w:t>
+      </w:r>
+    </w:p>
+    <w:p>
+      <w:pPr>
+        <w:spacing w:after="160" w:line="276"/>
+        <w:jc w:val="left"/>
+      </w:pPr>
+      <w:r>
+        <w:rPr>
+          <w:rFonts w:ascii="Times New Roman" w:cs="Times New Roman" w:eastAsia="Times New Roman" w:hAnsi="Times New Roman"/>
+          <w:sz w:val="24"/>
+          <w:szCs w:val="24"/>
+        </w:rPr>
+        <w:t xml:space="preserve">The first approach uses the classifier's own confidence. For every window, the probe outputs a probability for each of the four species, and the highest of the four serves as a confidence score. If the model were less confident on unfamiliar species than on its targets, a minimum-confidence threshold would filter them out. We calibrated the threshold on validation data alone, choosing the highest value that still retained at least 95% of validation recordings, so neither the test folds nor the auxiliary recordings influenced the choice. Overall separation between target and non-target recordings was summarised with the area under the ROC curve, which equals 1.0 for perfect separation and 0.5 for chance.</w:t>
+      </w:r>
+    </w:p>
+    <w:p>
+      <w:pPr>
+        <w:spacing w:after="160" w:line="276"/>
+        <w:jc w:val="left"/>
+      </w:pPr>
+      <w:r>
+        <w:rPr>
+          <w:rFonts w:ascii="Times New Roman" w:cs="Times New Roman" w:eastAsia="Times New Roman" w:hAnsi="Times New Roman"/>
+          <w:sz w:val="24"/>
+          <w:szCs w:val="24"/>
+        </w:rPr>
+        <w:t xml:space="preserve">The second approach makes rejection part of the classifier itself by adding a fifth output class for background species, so that non-target sound receives a label of its own instead of being forced into one of the four targets. To measure this fairly, the 28 auxiliary species were split in half. Windows from 14 species (1,077 recordings) formed the background class during training, and the remaining 14 species (814 recordings) acted as the test set for the false positive rate. The species in the test half were never seen by the model in any role, so the measured false positive rate reflects rejection of genuinely unfamiliar species rather than memory of specific training species.</w:t>
       </w:r>
     </w:p>
     <w:p>
@@ -1803,7 +1817,7 @@
           <w:sz w:val="24"/>
           <w:szCs w:val="24"/>
         </w:rPr>
-        <w:t xml:space="preserve">Robustness and reference comparison</w:t>
+        <w:t xml:space="preserve">Noise robustness</w:t>
       </w:r>
     </w:p>
     <w:p>
@@ -1817,7 +1831,7 @@
           <w:sz w:val="24"/>
           <w:szCs w:val="24"/>
         </w:rPr>
-        <w:t xml:space="preserve">To measure noise robustness, test windows were corrupted with additive white noise at 20, 10, 5, and 0 dB signal-to-noise ratio before embedding extraction, and evaluated with single-seed probes trained on clean data under the primary folds. As an external reference, BirdNET's own classifier output was recorded for every window, which provides a deployment-relevant comparison for the Forest Owlet, the one target species in its label set.</w:t>
+        <w:t xml:space="preserve">Archive recordings are mostly focal recordings made at close range, whereas autonomous recorders capture distant birds against wind, rain, and insect noise. To estimate how performance degrades under such conditions, we corrupted the test windows with additive white noise before extracting their embeddings, scaling the noise against the energy of each window to produce signal-to-noise ratios of 20, 10, 5, and 0 dB. At 20 dB the added noise is faint, and at 0 dB it is as loud as the recording itself. The corrupted windows were evaluated with probes that had been trained on clean audio under the primary cross-validation folds, so the results measure how a model trained on archive material copes with degraded input it has never encountered.</w:t>
       </w:r>
     </w:p>
     <w:p>
@@ -1835,7 +1849,7 @@
           <w:sz w:val="24"/>
           <w:szCs w:val="24"/>
         </w:rPr>
-        <w:t xml:space="preserve">Implementation</w:t>
+        <w:t xml:space="preserve">External baseline</w:t>
       </w:r>
     </w:p>
     <w:p>
@@ -1849,7 +1863,7 @@
           <w:sz w:val="24"/>
           <w:szCs w:val="24"/>
         </w:rPr>
-        <w:t xml:space="preserve">The classifiers were implemented in PyTorch 2.13, and embeddings were extracted with the BirdNET-Analyzer reference implementation. All experiments ran on a single consumer laptop. The full pipeline, from audit and windowing through splitting, embedding, training, and figure generation, is reproducible from the scripts in the accompanying repository. The audio itself is not redistributed, in accordance with archive terms, and the manifest lists every catalogue identifier so the exact dataset can be reassembled from the source archives.</w:t>
+        <w:t xml:space="preserve">BirdNET's own classification output was recorded for every window alongside the embeddings. The Forest Owlet is the one target species present in BirdNET's label set, so this output provides a direct comparison between our classifiers and the tool a practitioner could use today, and it documents what the other three species currently lack.</w:t>
       </w:r>
     </w:p>
     <w:p>
@@ -4690,7 +4704,7 @@
           <w:sz w:val="24"/>
           <w:szCs w:val="24"/>
         </w:rPr>
-        <w:t xml:space="preserve">Rejection of non-target species</w:t>
+        <w:t xml:space="preserve">Open-set recognition</w:t>
       </w:r>
     </w:p>
     <w:p>

</xml_diff>

<commit_message>
Drop the external BirdNET baseline throughout and tighten the open-set methods
</commit_message>
<xml_diff>
--- a/paper/manuscript.docx
+++ b/paper/manuscript.docx
@@ -1771,7 +1771,7 @@
           <w:sz w:val="24"/>
           <w:szCs w:val="24"/>
         </w:rPr>
-        <w:t xml:space="preserve">A classifier with four output classes will assign one of those four labels to every input it receives, including recordings of species it has never seen. A model can therefore be highly accurate on the four target species and still be unusable in the field, where most sounds come from other species. The problem of detecting that an input belongs to none of the trained classes is called open-set recognition, and we evaluated two approaches to it, using the 1,891 recordings of the 28 auxiliary species as realistic non-target material.</w:t>
+        <w:t xml:space="preserve">A classifier with four output classes will assign one of those four labels to every input it receives, including recordings of species it has never seen. A model can therefore be highly accurate on the four target species and still be unusable in the field, where most sounds come from other species. We evaluated two approaches to solve this problem, using the 1,891 recordings of the 28 auxiliary species as realistic non-target material.</w:t>
       </w:r>
     </w:p>
     <w:p>
@@ -1785,7 +1785,7 @@
           <w:sz w:val="24"/>
           <w:szCs w:val="24"/>
         </w:rPr>
-        <w:t xml:space="preserve">The first approach uses the classifier's own confidence. For every window, the probe outputs a probability for each of the four species, and the highest of the four serves as a confidence score. If the model were less confident on unfamiliar species than on its targets, a minimum-confidence threshold would filter them out. We calibrated the threshold on validation data alone, choosing the highest value that still retained at least 95% of validation recordings, so neither the test folds nor the auxiliary recordings influenced the choice. Overall separation between target and non-target recordings was summarised with the area under the ROC curve, which equals 1.0 for perfect separation and 0.5 for chance.</w:t>
+        <w:t xml:space="preserve">The first approach uses the classifier's own confidence. For every window, the probe outputs a probability for each of the four species, the highest of the four serves as a confidence score, and recordings scoring below a minimum threshold are rejected. The threshold was calibrated on validation data alone, as the highest value retaining at least 95% of validation recordings. Overall separation between target and non-target recordings was summarised with the area under the ROC curve.</w:t>
       </w:r>
     </w:p>
     <w:p>
@@ -1799,7 +1799,7 @@
           <w:sz w:val="24"/>
           <w:szCs w:val="24"/>
         </w:rPr>
-        <w:t xml:space="preserve">The second approach makes rejection part of the classifier itself by adding a fifth output class for background species, so that non-target sound receives a label of its own instead of being forced into one of the four targets. To measure this fairly, the 28 auxiliary species were split in half. Windows from 14 species (1,077 recordings) formed the background class during training, and the remaining 14 species (814 recordings) acted as the test set for the false positive rate. The species in the test half were never seen by the model in any role, so the measured false positive rate reflects rejection of genuinely unfamiliar species rather than memory of specific training species.</w:t>
+        <w:t xml:space="preserve">The second approach makes rejection part of the classifier itself by adding a fifth output class for background species. The 28 auxiliary species were split in half, with windows from 14 species (1,077 recordings) forming the background class during training and the remaining 14 species (814 recordings) acting as the test set for the false positive rate. The test species were never seen during training, so the measured false positive rate reflects rejection of genuinely unfamiliar species.</w:t>
       </w:r>
     </w:p>
     <w:p>
@@ -1832,38 +1832,6 @@
           <w:szCs w:val="24"/>
         </w:rPr>
         <w:t xml:space="preserve">Archive recordings are mostly focal recordings made at close range, whereas autonomous recorders capture distant birds against wind, rain, and insect noise. To estimate how performance degrades under such conditions, we corrupted the test windows with additive white noise before extracting their embeddings, scaling the noise against the energy of each window to produce signal-to-noise ratios of 20, 10, 5, and 0 dB. At 20 dB the added noise is faint, and at 0 dB it is as loud as the recording itself. The corrupted windows were evaluated with probes that had been trained on clean audio under the primary cross-validation folds, so the results measure how a model trained on archive material copes with degraded input it has never encountered.</w:t>
-      </w:r>
-    </w:p>
-    <w:p>
-      <w:pPr>
-        <w:pStyle w:val="Heading2"/>
-        <w:spacing w:after="120" w:before="240"/>
-      </w:pPr>
-      <w:r>
-        <w:rPr>
-          <w:rFonts w:ascii="Times New Roman" w:cs="Times New Roman" w:eastAsia="Times New Roman" w:hAnsi="Times New Roman"/>
-          <w:b/>
-          <w:bCs/>
-          <w:i/>
-          <w:iCs/>
-          <w:sz w:val="24"/>
-          <w:szCs w:val="24"/>
-        </w:rPr>
-        <w:t xml:space="preserve">External baseline</w:t>
-      </w:r>
-    </w:p>
-    <w:p>
-      <w:pPr>
-        <w:spacing w:after="160" w:line="276"/>
-        <w:jc w:val="left"/>
-      </w:pPr>
-      <w:r>
-        <w:rPr>
-          <w:rFonts w:ascii="Times New Roman" w:cs="Times New Roman" w:eastAsia="Times New Roman" w:hAnsi="Times New Roman"/>
-          <w:sz w:val="24"/>
-          <w:szCs w:val="24"/>
-        </w:rPr>
-        <w:t xml:space="preserve">BirdNET's own classification output was recorded for every window alongside the embeddings. The Forest Owlet is the one target species present in BirdNET's label set, so this output provides a direct comparison between our classifiers and the tool a practitioner could use today, and it documents what the other three species currently lack.</w:t>
       </w:r>
     </w:p>
     <w:p>
@@ -4578,38 +4546,6 @@
           <w:sz w:val="24"/>
           <w:szCs w:val="24"/>
         </w:rPr>
-        <w:t xml:space="preserve">Comparison with the global classifier</w:t>
-      </w:r>
-    </w:p>
-    <w:p>
-      <w:pPr>
-        <w:spacing w:after="160" w:line="276"/>
-        <w:jc w:val="left"/>
-      </w:pPr>
-      <w:r>
-        <w:rPr>
-          <w:rFonts w:ascii="Times New Roman" w:cs="Times New Roman" w:eastAsia="Times New Roman" w:hAnsi="Times New Roman"/>
-          <w:sz w:val="24"/>
-          <w:szCs w:val="24"/>
-        </w:rPr>
-        <w:t xml:space="preserve">BirdNET V2.4 contains a label for only the Forest Owlet among the four species. Its classifier assigned that label a mean confidence of 0.17 on windows that truly contain the species, reaching 1.0 only on the clearest calls, which is usable for coarse screening but well short of a reliable detector, and no equivalent output exists for the other three species. The probe operating on BirdNET's embeddings identified Forest Owlet recordings with an F1 of 0.98. The comparison shows that the embedding representation carries the information needed for these species even where the classifier itself has no corresponding output, which is the situation of most range-restricted threatened birds worldwide.</w:t>
-      </w:r>
-    </w:p>
-    <w:p>
-      <w:pPr>
-        <w:pStyle w:val="Heading2"/>
-        <w:spacing w:after="120" w:before="240"/>
-      </w:pPr>
-      <w:r>
-        <w:rPr>
-          <w:rFonts w:ascii="Times New Roman" w:cs="Times New Roman" w:eastAsia="Times New Roman" w:hAnsi="Times New Roman"/>
-          <w:b/>
-          <w:bCs/>
-          <w:i/>
-          <w:iCs/>
-          <w:sz w:val="24"/>
-          <w:szCs w:val="24"/>
-        </w:rPr>
         <w:t xml:space="preserve">Embedding adaptation on auxiliary species</w:t>
       </w:r>
     </w:p>
@@ -5297,7 +5233,7 @@
           <w:sz w:val="24"/>
           <w:szCs w:val="24"/>
         </w:rPr>
-        <w:t xml:space="preserve">The coverage gap that motivated the study deserves emphasis in its own right. Three of the four species examined here are absent from the label set of the most widely deployed global classifier, and for the one covered species the global classifier's native confidence averaged 0.17 on genuine vocalisations while a probe on its own embeddings reached an F1 of 0.98. Global models are trained where data are plentiful, and the species that conservation most urgently needs to monitor are precisely those for which little audio exists, so this mismatch is likely to be general rather than particular to India. Embedding-based probes offer a workable route across that gap.</w:t>
+        <w:t xml:space="preserve">The coverage gap that motivated the study deserves emphasis in its own right. Three of the four species examined here are absent from the label set of the most widely deployed global classifier. Global models are trained where data are plentiful, and the species that conservation most urgently needs to monitor are precisely those for which little audio exists, so this mismatch is likely to be general rather than particular to India. Embedding-based probes offer a workable route across that gap.</w:t>
       </w:r>
     </w:p>
     <w:p>
@@ -5353,7 +5289,7 @@
           <w:sz w:val="24"/>
           <w:szCs w:val="24"/>
         </w:rPr>
-        <w:t xml:space="preserve">Several limitations bound these conclusions. BirdNET's training corpus includes Xeno-canto material, so for the Forest Owlet some of the recordings used here may have contributed to its pretraining and could inflate embedding quality for that species, although the other three species have no labels in BirdNET and cannot have served as labelled positives. Archive recordings are focal and comparatively clean, so performance on soundscape audio from autonomous recorders will be lower than reported here, and additive white noise only approximates that difference. Field validation on continuous recordings at occupied sites is the necessary next step, and the Forest Owlet, for which acoustic survey is already operational practice, would allow a direct comparison between embedding-based detectors and BirdNET's native output on existing survey audio. The recording-event grouping is inferred from catalogue adjacency, and explicit recordist, site, and date metadata would sharpen it. Finally, with 12 to 75 recordings per class, all metrics carry wide confidence intervals, which we report throughout.</w:t>
+        <w:t xml:space="preserve">Several limitations bound these conclusions. BirdNET's training corpus includes Xeno-canto material, so for the Forest Owlet some of the recordings used here may have contributed to its pretraining and could inflate embedding quality for that species, although the other three species have no labels in BirdNET and cannot have served as labelled positives. Archive recordings are focal and comparatively clean, so performance on soundscape audio from autonomous recorders will be lower than reported here, and additive white noise only approximates that difference. Field validation on continuous recordings at occupied sites is the necessary next step. The recording-event grouping is inferred from catalogue adjacency, and explicit recordist, site, and date metadata would sharpen it. Finally, with 12 to 75 recordings per class, all metrics carry wide confidence intervals, which we report throughout.</w:t>
       </w:r>
     </w:p>
     <w:p>

</xml_diff>

<commit_message>
Reference sweep: cite every substantive claim, grow bibliography to 23 entries
Also merge latest Word edits and fix two repetitions flagged in the audit.
</commit_message>
<xml_diff>
--- a/paper/manuscript.docx
+++ b/paper/manuscript.docx
@@ -201,7 +201,7 @@
           <w:sz w:val="24"/>
           <w:szCs w:val="24"/>
         </w:rPr>
-        <w:t xml:space="preserve">India is home to over 1,300 bird species, of which more than 75 are considered endemic, occurring nowhere else in the world (SoIB 2023). Endemic species with narrow geographic ranges are disproportionately vulnerable to habitat loss, and several Indian endemics are now assessed as Endangered or Critically Endangered on the IUCN Red List (IUCN 2025). While rarely spotted in the wild, four such species have sound recordings available in the major public archives: Forest Owlet (</w:t>
+        <w:t xml:space="preserve">India is home to over 1,300 bird species, of which more than 75 are considered endemic, occurring nowhere else in the world (SoIB 2023). Endemic species with narrow geographic ranges are disproportionately vulnerable to habitat loss (Myers et al. 2000), and several Indian endemics are now assessed as Endangered or Critically Endangered on the IUCN Red List (IUCN 2025). While rarely spotted in the wild, four such species have sound recordings available in the major public archives: Forest Owlet (</w:t>
       </w:r>
       <w:r>
         <w:rPr>
@@ -287,7 +287,7 @@
           <w:sz w:val="24"/>
           <w:szCs w:val="24"/>
         </w:rPr>
-        <w:t xml:space="preserve">These four species are natural candidates for passive acoustic monitoring. They are nocturnal or skulking, occupy terrain where visual survey is difficult, and have distinctive vocalisations. Acoustic monitoring at useful scales, however, requires automated identification, because continuous recorders produce far more audio than observers can review. The classifiers that currently dominate applied bioacoustics cannot provide this identification for these species. We verified that only the Forest Owlet is present in the label set of BirdNET V2.4 (Kahl et al. 2021), the most widely used bird song classification system, and the other three species therefore cannot be detected by it at any confidence threshold. Therefore, there exists a need for classifiers specifically trained to classify these four species.</w:t>
+        <w:t xml:space="preserve">These four species are natural candidates for passive acoustic monitoring (Sugai et al. 2019). They are nocturnal or skulking, occupy terrain where visual survey is difficult, and have distinctive vocalisations, and automated recorders have already been deployed to search for one of them, Jerdon's Courser (Arvind et al. 2023). Acoustic monitoring at useful scales, however, requires automated identification, because continuous recorders produce far more audio than observers can review (Gibb et al. 2019). The classifiers that currently dominate applied bioacoustics cannot provide this identification for these species. We verified that only the Forest Owlet is present in the label set of BirdNET V2.4 (Kahl et al. 2021), the most widely used bird song classification system (Pérez-Granados 2023), and the other three species therefore cannot be detected by it at any confidence threshold. As a result, there exists a need for classifiers specifically trained to identify these four species.</w:t>
       </w:r>
     </w:p>
     <w:p>
@@ -315,7 +315,7 @@
           <w:sz w:val="24"/>
           <w:szCs w:val="24"/>
         </w:rPr>
-        <w:t xml:space="preserve">The study comprises four analyses. First, we compare three classifier families on the four-species identification task, a fine-tuned convolutional network on spectrograms representing standard practice, a lightweight classifier on frozen BirdNET embeddings, and a multiple instance learning model with attention that classifies whole recordings. We evaluate every model under two cross-validation schemes, one splitting at the level of the unique recording and a stricter one splitting at the level of the recording session. Then, we test whether retraining the embeddings on 28 other endemic Indian species makes the four target species easier to distinguish. We also evaluate whether the classifier can identify and reject species not included in our study, by evaluating it against 1,891 recordings of the 28 non-target endemics and adding an explicit background class as a remedy. Finally, we measure robustness by degrading test audio with additive noise at controlled signal-to-noise ratios. These analyses effectively build and evaluate bird sound classifiers using publicly available data, acting as a critical step towards full automated acoustic monitoring.</w:t>
+        <w:t xml:space="preserve">The study comprises four analyses. First, we compare three classifier families on the four-species identification task, a fine-tuned convolutional network on spectrograms representing standard practice, a lightweight classifier on frozen BirdNET embeddings, and a multiple instance learning model with attention that classifies whole recordings. We evaluate every model under two cross-validation schemes, one splitting at the level of the unique recording and a stricter one splitting at the level of the recording session. Then, we test whether retraining the embeddings on 28 other endemic Indian species makes the four target species easier to distinguish. We also evaluate whether the classifier can identify and reject species not included in our study, by testing it against 1,891 recordings of the 28 non-target endemics and adding an explicit background class as a remedy. Finally, we measure robustness by degrading test audio with additive noise at controlled signal-to-noise ratios. These analyses effectively build and evaluate bird sound classifiers using publicly available data, acting as a critical step towards full automated acoustic monitoring.</w:t>
       </w:r>
     </w:p>
     <w:p>
@@ -1591,7 +1591,7 @@
           <w:sz w:val="24"/>
           <w:szCs w:val="24"/>
         </w:rPr>
-        <w:t xml:space="preserve">Catalogue numbers encode provenance structure that the evaluation must respect. All 11 Macaulay Library recordings of Jerdon's Courser occupy one consecutive catalogue block (ML274533 to ML274543). These are the recordings made during the 2001 to 2002 surveys in Sri Lankamalleswara Wildlife Sanctuary (Jeganathan et al. 2002), and they therefore represent a single recording effort. To make such structure explicit for all species, we grouped recordings into recording events, defined as recordings of the same species from the same archive whose catalogue numbers lie within 1,000 of one another, as a proxy for same-session origin. These groups are the unit of splitting in the stricter evaluation scheme described next.</w:t>
+        <w:t xml:space="preserve">Catalogue numbers encode provenance structure that the evaluation must respect. All 11 Macaulay Library recordings of Jerdon's Courser occupy one consecutive catalogue block (ML274533 to ML274543). These are the recordings made during the 2001 to 2002 surveys in Sri Lankamalleswara Wildlife Sanctuary (Jeganathan et al. 2002, Arvind et al. 2023), and they therefore represent a single recording effort. To make such structure explicit for all species, we grouped recordings into recording events, defined as recordings of the same species from the same archive whose catalogue numbers lie within 1,000 of one another, as a proxy for same-session origin. These groups are the unit of splitting in the stricter evaluation scheme described next.</w:t>
       </w:r>
     </w:p>
     <w:p>
@@ -1651,7 +1651,7 @@
           <w:sz w:val="24"/>
           <w:szCs w:val="24"/>
         </w:rPr>
-        <w:t xml:space="preserve">Every experiment was repeated with three random seeds, and we report seed-averaged predictions together with the spread across seeds. Class imbalance was handled with inverse-frequency loss weighting. Uncertainty on accuracy and macro-F1 is reported as 95% percentile bootstrap confidence intervals over recordings, and paired model comparisons use exact McNemar tests on recording-level outcomes. The serialised splits, together with their generating seed, are distributed with the code.</w:t>
+        <w:t xml:space="preserve">Every experiment was repeated with three random seeds, and we report seed-averaged predictions together with the spread across seeds. Class imbalance was handled with inverse-frequency loss weighting. Uncertainty on accuracy and macro-F1 is reported as 95% percentile bootstrap confidence intervals over recordings (Efron and Tibshirani 1993), and paired model comparisons use exact McNemar tests on recording-level outcomes (Dietterich 1998). The serialised splits, together with their generating seed, are distributed with the code.</w:t>
       </w:r>
     </w:p>
     <w:p>
@@ -1683,7 +1683,7 @@
           <w:sz w:val="24"/>
           <w:szCs w:val="24"/>
         </w:rPr>
-        <w:t xml:space="preserve">The first model is a fine-tuned convolutional network representing standard practice in bioacoustic classification. An EfficientNet-B0 initialised from ImageNet weights was fine-tuned end to end on log-mel spectrograms of the three-second windows (128 mel bands, 32 kHz sample rate, 12 kHz frequency cap), with time and frequency masking, gain jitter, circular time shifting, and white noise injection applied to training data only. Model selection followed the same inner-validation protocol as all other models.</w:t>
+        <w:t xml:space="preserve">The first model is a fine-tuned convolutional network representing standard practice in bioacoustic classification (Stowell 2022). An EfficientNet-B0 (Tan and Le 2019) initialised from ImageNet weights (Deng et al. 2009) was fine-tuned end to end on log-mel spectrograms of the three-second windows (128 mel bands, 32 kHz sample rate, 12 kHz frequency cap), with time and frequency masking (Park et al. 2019), gain jitter, circular time shifting, and white noise injection applied to training data only. Model selection followed the same inner-validation protocol as all other models.</w:t>
       </w:r>
     </w:p>
     <w:p>
@@ -1771,21 +1771,21 @@
           <w:sz w:val="24"/>
           <w:szCs w:val="24"/>
         </w:rPr>
-        <w:t xml:space="preserve">A classifier with four output classes will assign one of those four labels to every input it receives, including recordings of species it has never seen. A model can therefore be highly accurate on the four target species and still be unusable in the field, where most sounds come from other species. We evaluated two approaches to solve this problem, using the 1,891 recordings of the 28 auxiliary species as realistic non-target material.</w:t>
-      </w:r>
-    </w:p>
-    <w:p>
-      <w:pPr>
-        <w:spacing w:after="160" w:line="276"/>
-        <w:jc w:val="left"/>
-      </w:pPr>
-      <w:r>
-        <w:rPr>
-          <w:rFonts w:ascii="Times New Roman" w:cs="Times New Roman" w:eastAsia="Times New Roman" w:hAnsi="Times New Roman"/>
-          <w:sz w:val="24"/>
-          <w:szCs w:val="24"/>
-        </w:rPr>
-        <w:t xml:space="preserve">The first approach uses the classifier's own confidence. For every window, the probe outputs a probability for each of the four species, the highest of the four serves as a confidence score, and recordings scoring below a minimum threshold are rejected. The threshold was calibrated on validation data alone, as the highest value retaining at least 95% of validation recordings. Overall separation between target and non-target recordings was summarised with the area under the ROC curve.</w:t>
+        <w:t xml:space="preserve">A classifier with four output classes will assign one of those four labels to every input it receives, including recordings of species it has never seen (Scheirer et al. 2013). A model can therefore be highly accurate on the four target species and still be unusable in the field, where most sounds come from other species. We evaluated two approaches to solve this problem, using the 1,891 recordings of the 28 auxiliary species as realistic non-target material.</w:t>
+      </w:r>
+    </w:p>
+    <w:p>
+      <w:pPr>
+        <w:spacing w:after="160" w:line="276"/>
+        <w:jc w:val="left"/>
+      </w:pPr>
+      <w:r>
+        <w:rPr>
+          <w:rFonts w:ascii="Times New Roman" w:cs="Times New Roman" w:eastAsia="Times New Roman" w:hAnsi="Times New Roman"/>
+          <w:sz w:val="24"/>
+          <w:szCs w:val="24"/>
+        </w:rPr>
+        <w:t xml:space="preserve">The first approach uses the classifier's own confidence (Hendrycks and Gimpel 2017). For every window, the probe outputs a probability for each of the four species, the highest of the four serves as a confidence score, and recordings scoring below a minimum threshold are rejected. The threshold was calibrated on validation data alone, as the highest value retaining at least 95% of validation recordings. Overall separation between target and non-target recordings was summarised with the area under the ROC curve.</w:t>
       </w:r>
     </w:p>
     <w:p>
@@ -1831,7 +1831,7 @@
           <w:sz w:val="24"/>
           <w:szCs w:val="24"/>
         </w:rPr>
-        <w:t xml:space="preserve">Archive recordings are mostly focal recordings made at close range, whereas autonomous recorders capture distant birds against wind, rain, and insect noise. To estimate how performance degrades under such conditions, we corrupted the test windows with additive white noise before extracting their embeddings, scaling the noise against the energy of each window to produce signal-to-noise ratios of 20, 10, 5, and 0 dB. At 20 dB the added noise is faint, and at 0 dB it is as loud as the recording itself. The corrupted windows were evaluated with probes that had been trained on clean audio under the primary cross-validation folds, so the results measure how a model trained on archive material copes with degraded input it has never encountered.</w:t>
+        <w:t xml:space="preserve">Archive recordings are mostly focal recordings made at close range, whereas autonomous recorders capture distant birds against wind, rain, and insect noise (Pérez-Granados 2023). To estimate how performance degrades under such conditions, we corrupted the test windows with additive white noise before extracting their embeddings, scaling the noise against the energy of each window to produce signal-to-noise ratios of 20, 10, 5, and 0 dB. At 20 dB the added noise is faint, and at 0 dB it is as loud as the recording itself. The corrupted windows were evaluated with probes that had been trained on clean audio under the primary cross-validation folds, so the results measure how a model trained on archive material copes with degraded input it has never encountered.</w:t>
       </w:r>
     </w:p>
     <w:p>
@@ -4420,7 +4420,7 @@
           <w:sz w:val="24"/>
           <w:szCs w:val="24"/>
         </w:rPr>
-        <w:t xml:space="preserve">The soft vote of the probe and the MIL model reached 97.9% accuracy with a macro-F1 of 0.984, a gain over the probe alone that is not statistically significant (p = 0.375). Equal-weight combination is nevertheless the appropriate form of ensembling at this data scale, because it combines complementary decision rules without spending any data on weight selection. Adding the network to this vote changed nothing.</w:t>
+        <w:t xml:space="preserve">The soft vote of the probe and the MIL model reached 97.9% accuracy with a macro-F1 of 0.984, a gain over the probe alone that is not statistically significant (p = 0.375). Equal-weight combination is nevertheless the appropriate form of ensembling at this data scale, because it combines complementary decision rules without spending any data on weight selection. Adding the network to this vote did not alter the results.</w:t>
       </w:r>
     </w:p>
     <w:p>
@@ -4514,7 +4514,7 @@
           <w:sz w:val="24"/>
           <w:szCs w:val="24"/>
         </w:rPr>
-        <w:t xml:space="preserve">Figure 3. Recording-level confusion matrices of the embedding probe under the primary recording-level scheme (left) and the stricter event-level scheme (right). The single event-level Jerdon's Courser test recording is the cross-source Xeno-canto file, which is classified correctly.</w:t>
+        <w:t xml:space="preserve">Figure 3. Recording-level confusion matrices of the embedding probe under the primary recording-level scheme (left) and the stricter event-level scheme (right).</w:t>
       </w:r>
     </w:p>
     <w:p>
@@ -4622,7 +4622,7 @@
           <w:sz w:val="24"/>
           <w:szCs w:val="24"/>
         </w:rPr>
-        <w:t xml:space="preserve">Figure 4. UMAP projections of the window embeddings of the four target species in the raw BirdNET space (left) and after auxiliary-species contrastive adaptation (right).</w:t>
+        <w:t xml:space="preserve">Figure 4. UMAP projections (McInnes et al. 2018) of the window embeddings of the four target species in the raw BirdNET space (left) and after auxiliary-species contrastive adaptation (right).</w:t>
       </w:r>
     </w:p>
     <w:p>
@@ -4654,7 +4654,7 @@
           <w:sz w:val="24"/>
           <w:szCs w:val="24"/>
         </w:rPr>
-        <w:t xml:space="preserve">Confidence thresholding on the four-class probe separated target from non-target recordings poorly. At the validation-calibrated threshold of 0.61, which retained 97.4% of target recordings, 93.7% of the 1,891 non-target recordings were also accepted, taking the worst case over folds, and the recording-level area under the ROC curve was 0.746 (window-level AUROC 0.868 ± 0.045 for maximum softmax probability and 0.878 ± 0.065 for the energy score, mean and standard deviation over folds). Deployed as it stands, the four-class model would produce confident false detections on most non-target species it heard.</w:t>
+        <w:t xml:space="preserve">Confidence thresholding on the four-class probe separated target from non-target recordings poorly. At the validation-calibrated threshold of 0.61, which retained 97.4% of target recordings, 93.7% of the 1,891 non-target recordings were also accepted, taking the worst case over folds, and the recording-level area under the ROC curve was 0.746 (window-level AUROC 0.868 ± 0.045 for maximum softmax probability and 0.878 ± 0.065 for the energy score (Liu et al. 2020), mean and standard deviation over folds). Deployed as it stands, the four-class model would produce confident false detections on most non-target species it heard.</w:t>
       </w:r>
     </w:p>
     <w:p>
@@ -5261,7 +5261,7 @@
           <w:sz w:val="24"/>
           <w:szCs w:val="24"/>
         </w:rPr>
-        <w:t xml:space="preserve">The evaluation design itself carries a transferable lesson. Catalogue numbers revealed that the entire Macaulay Library record of Jerdon's Courser derives from a single recording session, and grouping recordings into sessions changed the meaning of the evaluation for that species entirely. Recording-level splits are necessary in bioacoustics, but they are not sufficient when an archive's holdings cluster into a few recording efforts, and session-level grouping from catalogue structure costs nothing to implement. For Jerdon's Courser specifically, every piece of evidence the archive permits is positive, including the correct and confident classification of the single independent recording, but the quantity of that evidence is one recording, and only new field material can change this. The recordings from the 2025 reconfirmation would, if deposited publicly, provide the first opportunity in two decades to test any detector for this species on independent material, and we regard such deposition as the highest-value action available for its acoustic monitoring.</w:t>
+        <w:t xml:space="preserve">The evaluation design itself presents another important finding. Catalogue numbers revealed that the entire Macaulay Library record of Jerdon's Courser derives from a single recording session, and grouping recordings into sessions changed the meaning of the evaluation for that species entirely. Recording-level splits are necessary in bioacoustics, but they are not sufficient when an archive's holdings cluster into a few recording efforts, and session-level grouping from catalogue structure costs nothing to implement. For Jerdon's Courser specifically, every piece of evidence the archive permits is positive, including the correct and confident classification of the single independent recording, but the quantity of that evidence is one recording, and only new field material can change this. The recordings from the 2025 reconfirmation would, if deposited publicly, provide the first opportunity in two decades to test any detector for this species on independent material, and we regard such deposition as the highest-value action available for its acoustic monitoring.</w:t>
       </w:r>
     </w:p>
     <w:p>
@@ -5289,7 +5289,7 @@
           <w:sz w:val="24"/>
           <w:szCs w:val="24"/>
         </w:rPr>
-        <w:t xml:space="preserve">Several limitations bound these conclusions. BirdNET's training corpus includes Xeno-canto material, so for the Forest Owlet some of the recordings used here may have contributed to its pretraining and could inflate embedding quality for that species, although the other three species have no labels in BirdNET and cannot have served as labelled positives. Archive recordings are focal and comparatively clean, so performance on soundscape audio from autonomous recorders will be lower than reported here, and additive white noise only approximates that difference. Field validation on continuous recordings at occupied sites is the necessary next step. The recording-event grouping is inferred from catalogue adjacency, and explicit recordist, site, and date metadata would sharpen it. Finally, with 12 to 75 recordings per class, all metrics carry wide confidence intervals, which we report throughout.</w:t>
+        <w:t xml:space="preserve">Several limitations bound these conclusions. BirdNET's training corpus includes Xeno-canto material (Kahl et al. 2021), so for the Forest Owlet some of the recordings used here may have contributed to its pretraining and could inflate embedding quality for that species, although the other three species have no labels in BirdNET and cannot have served as labelled positives. Archive recordings are focal and comparatively clean, so performance on soundscape audio from autonomous recorders will be lower than reported here, and additive white noise only approximates that difference. Field validation on continuous recordings at occupied sites is the necessary next step. The recording-event grouping is inferred from catalogue adjacency, and explicit recordist, site, and date metadata would sharpen it. Finally, with 12 to 75 recordings per class, all metrics carry wide confidence intervals, which we report throughout.</w:t>
       </w:r>
     </w:p>
     <w:p>
@@ -5379,7 +5379,7 @@
           <w:sz w:val="24"/>
           <w:szCs w:val="24"/>
         </w:rPr>
-        <w:t xml:space="preserve">All code, the recording manifest with every Macaulay Library and Xeno-canto catalogue identifier, the split definitions, and the result files are available at https://github.com/srivatsav-kannan/birdSong. Audio is not redistributed, in accordance with archive terms, and the manifest permits exact reconstruction of the dataset from the source archives.</w:t>
+        <w:t xml:space="preserve">All code, the recording manifest with every Macaulay Library and Xeno-canto catalogue identifier, the split definitions, and the result files are available at https://github.com/srivatsav-kannan/bird-song. Audio is not redistributed, in accordance with archive terms, and the manifest permits exact reconstruction of the dataset from the source archives.</w:t>
       </w:r>
     </w:p>
     <w:p>
@@ -5409,7 +5409,7 @@
           <w:sz w:val="24"/>
           <w:szCs w:val="24"/>
         </w:rPr>
-        <w:t xml:space="preserve">Ghani, B., Denton, T., Kahl, S. and Klinck, H. (2023). Global birdsong embeddings enable superior transfer learning for bioacoustic classification. </w:t>
+        <w:t xml:space="preserve">Arvind, C., Joshi, V., Charif, R., Jeganathan, P. and Robin, V.V. (2023). Species detection framework using automated recording units: a case study of the Critically Endangered Jerdon's courser. </w:t>
       </w:r>
       <w:r>
         <w:rPr>
@@ -5419,29 +5419,29 @@
           <w:sz w:val="24"/>
           <w:szCs w:val="24"/>
         </w:rPr>
-        <w:t xml:space="preserve">Scientific Reports</w:t>
-      </w:r>
-      <w:r>
-        <w:rPr>
-          <w:rFonts w:ascii="Times New Roman" w:cs="Times New Roman" w:eastAsia="Times New Roman" w:hAnsi="Times New Roman"/>
-          <w:sz w:val="24"/>
-          <w:szCs w:val="24"/>
-        </w:rPr>
-        <w:t xml:space="preserve"> 13, 22876. https://doi.org/10.1038/s41598-023-49989-z.</w:t>
-      </w:r>
-    </w:p>
-    <w:p>
-      <w:pPr>
-        <w:spacing w:after="160" w:line="276"/>
-        <w:jc w:val="left"/>
-      </w:pPr>
-      <w:r>
-        <w:rPr>
-          <w:rFonts w:ascii="Times New Roman" w:cs="Times New Roman" w:eastAsia="Times New Roman" w:hAnsi="Times New Roman"/>
-          <w:sz w:val="24"/>
-          <w:szCs w:val="24"/>
-        </w:rPr>
-        <w:t xml:space="preserve">Ilse, M., Tomczak, J.M. and Welling, M. (2018). Attention-based deep multiple instance learning. </w:t>
+        <w:t xml:space="preserve">Oryx</w:t>
+      </w:r>
+      <w:r>
+        <w:rPr>
+          <w:rFonts w:ascii="Times New Roman" w:cs="Times New Roman" w:eastAsia="Times New Roman" w:hAnsi="Times New Roman"/>
+          <w:sz w:val="24"/>
+          <w:szCs w:val="24"/>
+        </w:rPr>
+        <w:t xml:space="preserve"> 57, 55–62. https://doi.org/10.1017/S0030605321000995.</w:t>
+      </w:r>
+    </w:p>
+    <w:p>
+      <w:pPr>
+        <w:spacing w:after="160" w:line="276"/>
+        <w:jc w:val="left"/>
+      </w:pPr>
+      <w:r>
+        <w:rPr>
+          <w:rFonts w:ascii="Times New Roman" w:cs="Times New Roman" w:eastAsia="Times New Roman" w:hAnsi="Times New Roman"/>
+          <w:sz w:val="24"/>
+          <w:szCs w:val="24"/>
+        </w:rPr>
+        <w:t xml:space="preserve">Deng, J., Dong, W., Socher, R., Li, L.-J., Li, K. and Fei-Fei, L. (2009). ImageNet: A large-scale hierarchical image database. </w:t>
       </w:r>
       <w:r>
         <w:rPr>
@@ -5451,29 +5451,29 @@
           <w:sz w:val="24"/>
           <w:szCs w:val="24"/>
         </w:rPr>
-        <w:t xml:space="preserve">Proceedings of the 35th International Conference on Machine Learning</w:t>
-      </w:r>
-      <w:r>
-        <w:rPr>
-          <w:rFonts w:ascii="Times New Roman" w:cs="Times New Roman" w:eastAsia="Times New Roman" w:hAnsi="Times New Roman"/>
-          <w:sz w:val="24"/>
-          <w:szCs w:val="24"/>
-        </w:rPr>
-        <w:t xml:space="preserve">, 2127–2136.</w:t>
-      </w:r>
-    </w:p>
-    <w:p>
-      <w:pPr>
-        <w:spacing w:after="160" w:line="276"/>
-        <w:jc w:val="left"/>
-      </w:pPr>
-      <w:r>
-        <w:rPr>
-          <w:rFonts w:ascii="Times New Roman" w:cs="Times New Roman" w:eastAsia="Times New Roman" w:hAnsi="Times New Roman"/>
-          <w:sz w:val="24"/>
-          <w:szCs w:val="24"/>
-        </w:rPr>
-        <w:t xml:space="preserve">IUCN (2025). </w:t>
+        <w:t xml:space="preserve">Proceedings of the IEEE Conference on Computer Vision and Pattern Recognition</w:t>
+      </w:r>
+      <w:r>
+        <w:rPr>
+          <w:rFonts w:ascii="Times New Roman" w:cs="Times New Roman" w:eastAsia="Times New Roman" w:hAnsi="Times New Roman"/>
+          <w:sz w:val="24"/>
+          <w:szCs w:val="24"/>
+        </w:rPr>
+        <w:t xml:space="preserve">, 248–255.</w:t>
+      </w:r>
+    </w:p>
+    <w:p>
+      <w:pPr>
+        <w:spacing w:after="160" w:line="276"/>
+        <w:jc w:val="left"/>
+      </w:pPr>
+      <w:r>
+        <w:rPr>
+          <w:rFonts w:ascii="Times New Roman" w:cs="Times New Roman" w:eastAsia="Times New Roman" w:hAnsi="Times New Roman"/>
+          <w:sz w:val="24"/>
+          <w:szCs w:val="24"/>
+        </w:rPr>
+        <w:t xml:space="preserve">Dietterich, T.G. (1998). Approximate statistical tests for comparing supervised classification learning algorithms. </w:t>
       </w:r>
       <w:r>
         <w:rPr>
@@ -5483,29 +5483,29 @@
           <w:sz w:val="24"/>
           <w:szCs w:val="24"/>
         </w:rPr>
-        <w:t xml:space="preserve">The IUCN Red List of Threatened Species</w:t>
-      </w:r>
-      <w:r>
-        <w:rPr>
-          <w:rFonts w:ascii="Times New Roman" w:cs="Times New Roman" w:eastAsia="Times New Roman" w:hAnsi="Times New Roman"/>
-          <w:sz w:val="24"/>
-          <w:szCs w:val="24"/>
-        </w:rPr>
-        <w:t xml:space="preserve">. https://www.iucnredlist.org (accessed 2026).</w:t>
-      </w:r>
-    </w:p>
-    <w:p>
-      <w:pPr>
-        <w:spacing w:after="160" w:line="276"/>
-        <w:jc w:val="left"/>
-      </w:pPr>
-      <w:r>
-        <w:rPr>
-          <w:rFonts w:ascii="Times New Roman" w:cs="Times New Roman" w:eastAsia="Times New Roman" w:hAnsi="Times New Roman"/>
-          <w:sz w:val="24"/>
-          <w:szCs w:val="24"/>
-        </w:rPr>
-        <w:t xml:space="preserve">Jeganathan, P., Green, R.E., Bowden, C.G.R., Norris, K., Pain, D. and Rahmani, A. (2002). Use of tracking strips and automatic cameras for detecting Critically Endangered Jerdon's coursers </w:t>
+        <w:t xml:space="preserve">Neural Computation</w:t>
+      </w:r>
+      <w:r>
+        <w:rPr>
+          <w:rFonts w:ascii="Times New Roman" w:cs="Times New Roman" w:eastAsia="Times New Roman" w:hAnsi="Times New Roman"/>
+          <w:sz w:val="24"/>
+          <w:szCs w:val="24"/>
+        </w:rPr>
+        <w:t xml:space="preserve"> 10, 1895–1923.</w:t>
+      </w:r>
+    </w:p>
+    <w:p>
+      <w:pPr>
+        <w:spacing w:after="160" w:line="276"/>
+        <w:jc w:val="left"/>
+      </w:pPr>
+      <w:r>
+        <w:rPr>
+          <w:rFonts w:ascii="Times New Roman" w:cs="Times New Roman" w:eastAsia="Times New Roman" w:hAnsi="Times New Roman"/>
+          <w:sz w:val="24"/>
+          <w:szCs w:val="24"/>
+        </w:rPr>
+        <w:t xml:space="preserve">Efron, B. and Tibshirani, R.J. (1993). </w:t>
       </w:r>
       <w:r>
         <w:rPr>
@@ -5515,15 +5515,29 @@
           <w:sz w:val="24"/>
           <w:szCs w:val="24"/>
         </w:rPr>
-        <w:t xml:space="preserve">Rhinoptilus bitorquatus</w:t>
-      </w:r>
-      <w:r>
-        <w:rPr>
-          <w:rFonts w:ascii="Times New Roman" w:cs="Times New Roman" w:eastAsia="Times New Roman" w:hAnsi="Times New Roman"/>
-          <w:sz w:val="24"/>
-          <w:szCs w:val="24"/>
-        </w:rPr>
-        <w:t xml:space="preserve"> in scrub jungle in Andhra Pradesh, India. </w:t>
+        <w:t xml:space="preserve">An Introduction to the Bootstrap</w:t>
+      </w:r>
+      <w:r>
+        <w:rPr>
+          <w:rFonts w:ascii="Times New Roman" w:cs="Times New Roman" w:eastAsia="Times New Roman" w:hAnsi="Times New Roman"/>
+          <w:sz w:val="24"/>
+          <w:szCs w:val="24"/>
+        </w:rPr>
+        <w:t xml:space="preserve">. New York: Chapman and Hall.</w:t>
+      </w:r>
+    </w:p>
+    <w:p>
+      <w:pPr>
+        <w:spacing w:after="160" w:line="276"/>
+        <w:jc w:val="left"/>
+      </w:pPr>
+      <w:r>
+        <w:rPr>
+          <w:rFonts w:ascii="Times New Roman" w:cs="Times New Roman" w:eastAsia="Times New Roman" w:hAnsi="Times New Roman"/>
+          <w:sz w:val="24"/>
+          <w:szCs w:val="24"/>
+        </w:rPr>
+        <w:t xml:space="preserve">Ghani, B., Denton, T., Kahl, S. and Klinck, H. (2023). Global birdsong embeddings enable superior transfer learning for bioacoustic classification. </w:t>
       </w:r>
       <w:r>
         <w:rPr>
@@ -5533,29 +5547,29 @@
           <w:sz w:val="24"/>
           <w:szCs w:val="24"/>
         </w:rPr>
-        <w:t xml:space="preserve">Oryx</w:t>
-      </w:r>
-      <w:r>
-        <w:rPr>
-          <w:rFonts w:ascii="Times New Roman" w:cs="Times New Roman" w:eastAsia="Times New Roman" w:hAnsi="Times New Roman"/>
-          <w:sz w:val="24"/>
-          <w:szCs w:val="24"/>
-        </w:rPr>
-        <w:t xml:space="preserve"> 36, 182–188.</w:t>
-      </w:r>
-    </w:p>
-    <w:p>
-      <w:pPr>
-        <w:spacing w:after="160" w:line="276"/>
-        <w:jc w:val="left"/>
-      </w:pPr>
-      <w:r>
-        <w:rPr>
-          <w:rFonts w:ascii="Times New Roman" w:cs="Times New Roman" w:eastAsia="Times New Roman" w:hAnsi="Times New Roman"/>
-          <w:sz w:val="24"/>
-          <w:szCs w:val="24"/>
-        </w:rPr>
-        <w:t xml:space="preserve">Kahl, S., Wood, C.M., Eibl, M. and Klinck, H. (2021). BirdNET: A deep learning solution for avian diversity monitoring. </w:t>
+        <w:t xml:space="preserve">Scientific Reports</w:t>
+      </w:r>
+      <w:r>
+        <w:rPr>
+          <w:rFonts w:ascii="Times New Roman" w:cs="Times New Roman" w:eastAsia="Times New Roman" w:hAnsi="Times New Roman"/>
+          <w:sz w:val="24"/>
+          <w:szCs w:val="24"/>
+        </w:rPr>
+        <w:t xml:space="preserve"> 13, 22876. https://doi.org/10.1038/s41598-023-49989-z.</w:t>
+      </w:r>
+    </w:p>
+    <w:p>
+      <w:pPr>
+        <w:spacing w:after="160" w:line="276"/>
+        <w:jc w:val="left"/>
+      </w:pPr>
+      <w:r>
+        <w:rPr>
+          <w:rFonts w:ascii="Times New Roman" w:cs="Times New Roman" w:eastAsia="Times New Roman" w:hAnsi="Times New Roman"/>
+          <w:sz w:val="24"/>
+          <w:szCs w:val="24"/>
+        </w:rPr>
+        <w:t xml:space="preserve">Gibb, R., Browning, E., Glover-Kapfer, P. and Jones, K.E. (2019). Emerging opportunities and challenges for passive acoustics in ecological assessment and monitoring. </w:t>
       </w:r>
       <w:r>
         <w:rPr>
@@ -5565,29 +5579,29 @@
           <w:sz w:val="24"/>
           <w:szCs w:val="24"/>
         </w:rPr>
-        <w:t xml:space="preserve">Ecological Informatics</w:t>
-      </w:r>
-      <w:r>
-        <w:rPr>
-          <w:rFonts w:ascii="Times New Roman" w:cs="Times New Roman" w:eastAsia="Times New Roman" w:hAnsi="Times New Roman"/>
-          <w:sz w:val="24"/>
-          <w:szCs w:val="24"/>
-        </w:rPr>
-        <w:t xml:space="preserve"> 61, 101236. https://doi.org/10.1016/j.ecoinf.2021.101236.</w:t>
-      </w:r>
-    </w:p>
-    <w:p>
-      <w:pPr>
-        <w:spacing w:after="160" w:line="276"/>
-        <w:jc w:val="left"/>
-      </w:pPr>
-      <w:r>
-        <w:rPr>
-          <w:rFonts w:ascii="Times New Roman" w:cs="Times New Roman" w:eastAsia="Times New Roman" w:hAnsi="Times New Roman"/>
-          <w:sz w:val="24"/>
-          <w:szCs w:val="24"/>
-        </w:rPr>
-        <w:t xml:space="preserve">Khosla, P., Teterwak, P., Wang, C., Sarna, A., Tian, Y., Isola, P. et al. (2020). Supervised contrastive learning. </w:t>
+        <w:t xml:space="preserve">Methods in Ecology and Evolution</w:t>
+      </w:r>
+      <w:r>
+        <w:rPr>
+          <w:rFonts w:ascii="Times New Roman" w:cs="Times New Roman" w:eastAsia="Times New Roman" w:hAnsi="Times New Roman"/>
+          <w:sz w:val="24"/>
+          <w:szCs w:val="24"/>
+        </w:rPr>
+        <w:t xml:space="preserve"> 10, 169–185.</w:t>
+      </w:r>
+    </w:p>
+    <w:p>
+      <w:pPr>
+        <w:spacing w:after="160" w:line="276"/>
+        <w:jc w:val="left"/>
+      </w:pPr>
+      <w:r>
+        <w:rPr>
+          <w:rFonts w:ascii="Times New Roman" w:cs="Times New Roman" w:eastAsia="Times New Roman" w:hAnsi="Times New Roman"/>
+          <w:sz w:val="24"/>
+          <w:szCs w:val="24"/>
+        </w:rPr>
+        <w:t xml:space="preserve">Hendrycks, D. and Gimpel, K. (2017). A baseline for detecting misclassified and out-of-distribution examples in neural networks. </w:t>
       </w:r>
       <w:r>
         <w:rPr>
@@ -5597,43 +5611,29 @@
           <w:sz w:val="24"/>
           <w:szCs w:val="24"/>
         </w:rPr>
-        <w:t xml:space="preserve">Advances in Neural Information Processing Systems</w:t>
-      </w:r>
-      <w:r>
-        <w:rPr>
-          <w:rFonts w:ascii="Times New Roman" w:cs="Times New Roman" w:eastAsia="Times New Roman" w:hAnsi="Times New Roman"/>
-          <w:sz w:val="24"/>
-          <w:szCs w:val="24"/>
-        </w:rPr>
-        <w:t xml:space="preserve"> 33, 18661–18673.</w:t>
-      </w:r>
-    </w:p>
-    <w:p>
-      <w:pPr>
-        <w:spacing w:after="160" w:line="276"/>
-        <w:jc w:val="left"/>
-      </w:pPr>
-      <w:r>
-        <w:rPr>
-          <w:rFonts w:ascii="Times New Roman" w:cs="Times New Roman" w:eastAsia="Times New Roman" w:hAnsi="Times New Roman"/>
-          <w:sz w:val="24"/>
-          <w:szCs w:val="24"/>
-        </w:rPr>
-        <w:t xml:space="preserve">Search for Lost Birds (2025). Jerdon's Courser. https://searchforlostbirds.org/birds/jerdons-courser (accessed 2026).</w:t>
-      </w:r>
-    </w:p>
-    <w:p>
-      <w:pPr>
-        <w:spacing w:after="160" w:line="276"/>
-        <w:jc w:val="left"/>
-      </w:pPr>
-      <w:r>
-        <w:rPr>
-          <w:rFonts w:ascii="Times New Roman" w:cs="Times New Roman" w:eastAsia="Times New Roman" w:hAnsi="Times New Roman"/>
-          <w:sz w:val="24"/>
-          <w:szCs w:val="24"/>
-        </w:rPr>
-        <w:t xml:space="preserve">SoIB (2023). </w:t>
+        <w:t xml:space="preserve">Proceedings of the International Conference on Learning Representations</w:t>
+      </w:r>
+      <w:r>
+        <w:rPr>
+          <w:rFonts w:ascii="Times New Roman" w:cs="Times New Roman" w:eastAsia="Times New Roman" w:hAnsi="Times New Roman"/>
+          <w:sz w:val="24"/>
+          <w:szCs w:val="24"/>
+        </w:rPr>
+        <w:t xml:space="preserve">.</w:t>
+      </w:r>
+    </w:p>
+    <w:p>
+      <w:pPr>
+        <w:spacing w:after="160" w:line="276"/>
+        <w:jc w:val="left"/>
+      </w:pPr>
+      <w:r>
+        <w:rPr>
+          <w:rFonts w:ascii="Times New Roman" w:cs="Times New Roman" w:eastAsia="Times New Roman" w:hAnsi="Times New Roman"/>
+          <w:sz w:val="24"/>
+          <w:szCs w:val="24"/>
+        </w:rPr>
+        <w:t xml:space="preserve">Ilse, M., Tomczak, J.M. and Welling, M. (2018). Attention-based deep multiple instance learning. </w:t>
       </w:r>
       <w:r>
         <w:rPr>
@@ -5643,6 +5643,372 @@
           <w:sz w:val="24"/>
           <w:szCs w:val="24"/>
         </w:rPr>
+        <w:t xml:space="preserve">Proceedings of the 35th International Conference on Machine Learning</w:t>
+      </w:r>
+      <w:r>
+        <w:rPr>
+          <w:rFonts w:ascii="Times New Roman" w:cs="Times New Roman" w:eastAsia="Times New Roman" w:hAnsi="Times New Roman"/>
+          <w:sz w:val="24"/>
+          <w:szCs w:val="24"/>
+        </w:rPr>
+        <w:t xml:space="preserve">, 2127–2136.</w:t>
+      </w:r>
+    </w:p>
+    <w:p>
+      <w:pPr>
+        <w:spacing w:after="160" w:line="276"/>
+        <w:jc w:val="left"/>
+      </w:pPr>
+      <w:r>
+        <w:rPr>
+          <w:rFonts w:ascii="Times New Roman" w:cs="Times New Roman" w:eastAsia="Times New Roman" w:hAnsi="Times New Roman"/>
+          <w:sz w:val="24"/>
+          <w:szCs w:val="24"/>
+        </w:rPr>
+        <w:t xml:space="preserve">IUCN (2025). </w:t>
+      </w:r>
+      <w:r>
+        <w:rPr>
+          <w:rFonts w:ascii="Times New Roman" w:cs="Times New Roman" w:eastAsia="Times New Roman" w:hAnsi="Times New Roman"/>
+          <w:i/>
+          <w:iCs/>
+          <w:sz w:val="24"/>
+          <w:szCs w:val="24"/>
+        </w:rPr>
+        <w:t xml:space="preserve">The IUCN Red List of Threatened Species</w:t>
+      </w:r>
+      <w:r>
+        <w:rPr>
+          <w:rFonts w:ascii="Times New Roman" w:cs="Times New Roman" w:eastAsia="Times New Roman" w:hAnsi="Times New Roman"/>
+          <w:sz w:val="24"/>
+          <w:szCs w:val="24"/>
+        </w:rPr>
+        <w:t xml:space="preserve">. https://www.iucnredlist.org (accessed 2026).</w:t>
+      </w:r>
+    </w:p>
+    <w:p>
+      <w:pPr>
+        <w:spacing w:after="160" w:line="276"/>
+        <w:jc w:val="left"/>
+      </w:pPr>
+      <w:r>
+        <w:rPr>
+          <w:rFonts w:ascii="Times New Roman" w:cs="Times New Roman" w:eastAsia="Times New Roman" w:hAnsi="Times New Roman"/>
+          <w:sz w:val="24"/>
+          <w:szCs w:val="24"/>
+        </w:rPr>
+        <w:t xml:space="preserve">Jeganathan, P., Green, R.E., Bowden, C.G.R., Norris, K., Pain, D. and Rahmani, A. (2002). Use of tracking strips and automatic cameras for detecting Critically Endangered Jerdon's coursers </w:t>
+      </w:r>
+      <w:r>
+        <w:rPr>
+          <w:rFonts w:ascii="Times New Roman" w:cs="Times New Roman" w:eastAsia="Times New Roman" w:hAnsi="Times New Roman"/>
+          <w:i/>
+          <w:iCs/>
+          <w:sz w:val="24"/>
+          <w:szCs w:val="24"/>
+        </w:rPr>
+        <w:t xml:space="preserve">Rhinoptilus bitorquatus</w:t>
+      </w:r>
+      <w:r>
+        <w:rPr>
+          <w:rFonts w:ascii="Times New Roman" w:cs="Times New Roman" w:eastAsia="Times New Roman" w:hAnsi="Times New Roman"/>
+          <w:sz w:val="24"/>
+          <w:szCs w:val="24"/>
+        </w:rPr>
+        <w:t xml:space="preserve"> in scrub jungle in Andhra Pradesh, India. </w:t>
+      </w:r>
+      <w:r>
+        <w:rPr>
+          <w:rFonts w:ascii="Times New Roman" w:cs="Times New Roman" w:eastAsia="Times New Roman" w:hAnsi="Times New Roman"/>
+          <w:i/>
+          <w:iCs/>
+          <w:sz w:val="24"/>
+          <w:szCs w:val="24"/>
+        </w:rPr>
+        <w:t xml:space="preserve">Oryx</w:t>
+      </w:r>
+      <w:r>
+        <w:rPr>
+          <w:rFonts w:ascii="Times New Roman" w:cs="Times New Roman" w:eastAsia="Times New Roman" w:hAnsi="Times New Roman"/>
+          <w:sz w:val="24"/>
+          <w:szCs w:val="24"/>
+        </w:rPr>
+        <w:t xml:space="preserve"> 36, 182–188.</w:t>
+      </w:r>
+    </w:p>
+    <w:p>
+      <w:pPr>
+        <w:spacing w:after="160" w:line="276"/>
+        <w:jc w:val="left"/>
+      </w:pPr>
+      <w:r>
+        <w:rPr>
+          <w:rFonts w:ascii="Times New Roman" w:cs="Times New Roman" w:eastAsia="Times New Roman" w:hAnsi="Times New Roman"/>
+          <w:sz w:val="24"/>
+          <w:szCs w:val="24"/>
+        </w:rPr>
+        <w:t xml:space="preserve">Kahl, S., Wood, C.M., Eibl, M. and Klinck, H. (2021). BirdNET: A deep learning solution for avian diversity monitoring. </w:t>
+      </w:r>
+      <w:r>
+        <w:rPr>
+          <w:rFonts w:ascii="Times New Roman" w:cs="Times New Roman" w:eastAsia="Times New Roman" w:hAnsi="Times New Roman"/>
+          <w:i/>
+          <w:iCs/>
+          <w:sz w:val="24"/>
+          <w:szCs w:val="24"/>
+        </w:rPr>
+        <w:t xml:space="preserve">Ecological Informatics</w:t>
+      </w:r>
+      <w:r>
+        <w:rPr>
+          <w:rFonts w:ascii="Times New Roman" w:cs="Times New Roman" w:eastAsia="Times New Roman" w:hAnsi="Times New Roman"/>
+          <w:sz w:val="24"/>
+          <w:szCs w:val="24"/>
+        </w:rPr>
+        <w:t xml:space="preserve"> 61, 101236. https://doi.org/10.1016/j.ecoinf.2021.101236.</w:t>
+      </w:r>
+    </w:p>
+    <w:p>
+      <w:pPr>
+        <w:spacing w:after="160" w:line="276"/>
+        <w:jc w:val="left"/>
+      </w:pPr>
+      <w:r>
+        <w:rPr>
+          <w:rFonts w:ascii="Times New Roman" w:cs="Times New Roman" w:eastAsia="Times New Roman" w:hAnsi="Times New Roman"/>
+          <w:sz w:val="24"/>
+          <w:szCs w:val="24"/>
+        </w:rPr>
+        <w:t xml:space="preserve">Khosla, P., Teterwak, P., Wang, C., Sarna, A., Tian, Y., Isola, P. et al. (2020). Supervised contrastive learning. </w:t>
+      </w:r>
+      <w:r>
+        <w:rPr>
+          <w:rFonts w:ascii="Times New Roman" w:cs="Times New Roman" w:eastAsia="Times New Roman" w:hAnsi="Times New Roman"/>
+          <w:i/>
+          <w:iCs/>
+          <w:sz w:val="24"/>
+          <w:szCs w:val="24"/>
+        </w:rPr>
+        <w:t xml:space="preserve">Advances in Neural Information Processing Systems</w:t>
+      </w:r>
+      <w:r>
+        <w:rPr>
+          <w:rFonts w:ascii="Times New Roman" w:cs="Times New Roman" w:eastAsia="Times New Roman" w:hAnsi="Times New Roman"/>
+          <w:sz w:val="24"/>
+          <w:szCs w:val="24"/>
+        </w:rPr>
+        <w:t xml:space="preserve"> 33, 18661–18673.</w:t>
+      </w:r>
+    </w:p>
+    <w:p>
+      <w:pPr>
+        <w:spacing w:after="160" w:line="276"/>
+        <w:jc w:val="left"/>
+      </w:pPr>
+      <w:r>
+        <w:rPr>
+          <w:rFonts w:ascii="Times New Roman" w:cs="Times New Roman" w:eastAsia="Times New Roman" w:hAnsi="Times New Roman"/>
+          <w:sz w:val="24"/>
+          <w:szCs w:val="24"/>
+        </w:rPr>
+        <w:t xml:space="preserve">Liu, W., Wang, X., Owens, J. and Li, Y. (2020). Energy-based out-of-distribution detection. </w:t>
+      </w:r>
+      <w:r>
+        <w:rPr>
+          <w:rFonts w:ascii="Times New Roman" w:cs="Times New Roman" w:eastAsia="Times New Roman" w:hAnsi="Times New Roman"/>
+          <w:i/>
+          <w:iCs/>
+          <w:sz w:val="24"/>
+          <w:szCs w:val="24"/>
+        </w:rPr>
+        <w:t xml:space="preserve">Advances in Neural Information Processing Systems</w:t>
+      </w:r>
+      <w:r>
+        <w:rPr>
+          <w:rFonts w:ascii="Times New Roman" w:cs="Times New Roman" w:eastAsia="Times New Roman" w:hAnsi="Times New Roman"/>
+          <w:sz w:val="24"/>
+          <w:szCs w:val="24"/>
+        </w:rPr>
+        <w:t xml:space="preserve"> 33, 21464–21475.</w:t>
+      </w:r>
+    </w:p>
+    <w:p>
+      <w:pPr>
+        <w:spacing w:after="160" w:line="276"/>
+        <w:jc w:val="left"/>
+      </w:pPr>
+      <w:r>
+        <w:rPr>
+          <w:rFonts w:ascii="Times New Roman" w:cs="Times New Roman" w:eastAsia="Times New Roman" w:hAnsi="Times New Roman"/>
+          <w:sz w:val="24"/>
+          <w:szCs w:val="24"/>
+        </w:rPr>
+        <w:t xml:space="preserve">McInnes, L., Healy, J. and Melville, J. (2018). UMAP: Uniform manifold approximation and projection for dimension reduction. arXiv:1802.03426.</w:t>
+      </w:r>
+    </w:p>
+    <w:p>
+      <w:pPr>
+        <w:spacing w:after="160" w:line="276"/>
+        <w:jc w:val="left"/>
+      </w:pPr>
+      <w:r>
+        <w:rPr>
+          <w:rFonts w:ascii="Times New Roman" w:cs="Times New Roman" w:eastAsia="Times New Roman" w:hAnsi="Times New Roman"/>
+          <w:sz w:val="24"/>
+          <w:szCs w:val="24"/>
+        </w:rPr>
+        <w:t xml:space="preserve">Myers, N., Mittermeier, R.A., Mittermeier, C.G., da Fonseca, G.A.B. and Kent, J. (2000). Biodiversity hotspots for conservation priorities. </w:t>
+      </w:r>
+      <w:r>
+        <w:rPr>
+          <w:rFonts w:ascii="Times New Roman" w:cs="Times New Roman" w:eastAsia="Times New Roman" w:hAnsi="Times New Roman"/>
+          <w:i/>
+          <w:iCs/>
+          <w:sz w:val="24"/>
+          <w:szCs w:val="24"/>
+        </w:rPr>
+        <w:t xml:space="preserve">Nature</w:t>
+      </w:r>
+      <w:r>
+        <w:rPr>
+          <w:rFonts w:ascii="Times New Roman" w:cs="Times New Roman" w:eastAsia="Times New Roman" w:hAnsi="Times New Roman"/>
+          <w:sz w:val="24"/>
+          <w:szCs w:val="24"/>
+        </w:rPr>
+        <w:t xml:space="preserve"> 403, 853–858.</w:t>
+      </w:r>
+    </w:p>
+    <w:p>
+      <w:pPr>
+        <w:spacing w:after="160" w:line="276"/>
+        <w:jc w:val="left"/>
+      </w:pPr>
+      <w:r>
+        <w:rPr>
+          <w:rFonts w:ascii="Times New Roman" w:cs="Times New Roman" w:eastAsia="Times New Roman" w:hAnsi="Times New Roman"/>
+          <w:sz w:val="24"/>
+          <w:szCs w:val="24"/>
+        </w:rPr>
+        <w:t xml:space="preserve">Park, D.S., Chan, W., Zhang, Y., Chiu, C.-C., Zoph, B., Cubuk, E.D. and Le, Q.V. (2019). SpecAugment: A simple data augmentation method for automatic speech recognition. </w:t>
+      </w:r>
+      <w:r>
+        <w:rPr>
+          <w:rFonts w:ascii="Times New Roman" w:cs="Times New Roman" w:eastAsia="Times New Roman" w:hAnsi="Times New Roman"/>
+          <w:i/>
+          <w:iCs/>
+          <w:sz w:val="24"/>
+          <w:szCs w:val="24"/>
+        </w:rPr>
+        <w:t xml:space="preserve">Proceedings of Interspeech 2019</w:t>
+      </w:r>
+      <w:r>
+        <w:rPr>
+          <w:rFonts w:ascii="Times New Roman" w:cs="Times New Roman" w:eastAsia="Times New Roman" w:hAnsi="Times New Roman"/>
+          <w:sz w:val="24"/>
+          <w:szCs w:val="24"/>
+        </w:rPr>
+        <w:t xml:space="preserve">, 2613–2617.</w:t>
+      </w:r>
+    </w:p>
+    <w:p>
+      <w:pPr>
+        <w:spacing w:after="160" w:line="276"/>
+        <w:jc w:val="left"/>
+      </w:pPr>
+      <w:r>
+        <w:rPr>
+          <w:rFonts w:ascii="Times New Roman" w:cs="Times New Roman" w:eastAsia="Times New Roman" w:hAnsi="Times New Roman"/>
+          <w:sz w:val="24"/>
+          <w:szCs w:val="24"/>
+        </w:rPr>
+        <w:t xml:space="preserve">Pérez-Granados, C. (2023). BirdNET: applications, performance, pitfalls and future opportunities. </w:t>
+      </w:r>
+      <w:r>
+        <w:rPr>
+          <w:rFonts w:ascii="Times New Roman" w:cs="Times New Roman" w:eastAsia="Times New Roman" w:hAnsi="Times New Roman"/>
+          <w:i/>
+          <w:iCs/>
+          <w:sz w:val="24"/>
+          <w:szCs w:val="24"/>
+        </w:rPr>
+        <w:t xml:space="preserve">Ibis</w:t>
+      </w:r>
+      <w:r>
+        <w:rPr>
+          <w:rFonts w:ascii="Times New Roman" w:cs="Times New Roman" w:eastAsia="Times New Roman" w:hAnsi="Times New Roman"/>
+          <w:sz w:val="24"/>
+          <w:szCs w:val="24"/>
+        </w:rPr>
+        <w:t xml:space="preserve"> 165, 1068–1075. https://doi.org/10.1111/ibi.13193.</w:t>
+      </w:r>
+    </w:p>
+    <w:p>
+      <w:pPr>
+        <w:spacing w:after="160" w:line="276"/>
+        <w:jc w:val="left"/>
+      </w:pPr>
+      <w:r>
+        <w:rPr>
+          <w:rFonts w:ascii="Times New Roman" w:cs="Times New Roman" w:eastAsia="Times New Roman" w:hAnsi="Times New Roman"/>
+          <w:sz w:val="24"/>
+          <w:szCs w:val="24"/>
+        </w:rPr>
+        <w:t xml:space="preserve">Scheirer, W.J., de Rezende Rocha, A., Sapkota, A. and Boult, T.E. (2013). Toward open set recognition. </w:t>
+      </w:r>
+      <w:r>
+        <w:rPr>
+          <w:rFonts w:ascii="Times New Roman" w:cs="Times New Roman" w:eastAsia="Times New Roman" w:hAnsi="Times New Roman"/>
+          <w:i/>
+          <w:iCs/>
+          <w:sz w:val="24"/>
+          <w:szCs w:val="24"/>
+        </w:rPr>
+        <w:t xml:space="preserve">IEEE Transactions on Pattern Analysis and Machine Intelligence</w:t>
+      </w:r>
+      <w:r>
+        <w:rPr>
+          <w:rFonts w:ascii="Times New Roman" w:cs="Times New Roman" w:eastAsia="Times New Roman" w:hAnsi="Times New Roman"/>
+          <w:sz w:val="24"/>
+          <w:szCs w:val="24"/>
+        </w:rPr>
+        <w:t xml:space="preserve"> 35, 1757–1772.</w:t>
+      </w:r>
+    </w:p>
+    <w:p>
+      <w:pPr>
+        <w:spacing w:after="160" w:line="276"/>
+        <w:jc w:val="left"/>
+      </w:pPr>
+      <w:r>
+        <w:rPr>
+          <w:rFonts w:ascii="Times New Roman" w:cs="Times New Roman" w:eastAsia="Times New Roman" w:hAnsi="Times New Roman"/>
+          <w:sz w:val="24"/>
+          <w:szCs w:val="24"/>
+        </w:rPr>
+        <w:t xml:space="preserve">Search for Lost Birds (2025). Jerdon's Courser. https://searchforlostbirds.org/birds/jerdons-courser (accessed 2026).</w:t>
+      </w:r>
+    </w:p>
+    <w:p>
+      <w:pPr>
+        <w:spacing w:after="160" w:line="276"/>
+        <w:jc w:val="left"/>
+      </w:pPr>
+      <w:r>
+        <w:rPr>
+          <w:rFonts w:ascii="Times New Roman" w:cs="Times New Roman" w:eastAsia="Times New Roman" w:hAnsi="Times New Roman"/>
+          <w:sz w:val="24"/>
+          <w:szCs w:val="24"/>
+        </w:rPr>
+        <w:t xml:space="preserve">SoIB (2023). </w:t>
+      </w:r>
+      <w:r>
+        <w:rPr>
+          <w:rFonts w:ascii="Times New Roman" w:cs="Times New Roman" w:eastAsia="Times New Roman" w:hAnsi="Times New Roman"/>
+          <w:i/>
+          <w:iCs/>
+          <w:sz w:val="24"/>
+          <w:szCs w:val="24"/>
+        </w:rPr>
         <w:t xml:space="preserve">State of India's Birds, 2023: Range, Trends, and Conservation Status</w:t>
       </w:r>
       <w:r>
@@ -5652,6 +6018,102 @@
           <w:szCs w:val="24"/>
         </w:rPr>
         <w:t xml:space="preserve">. Zenodo. https://doi.org/10.5281/zenodo.11124590.</w:t>
+      </w:r>
+    </w:p>
+    <w:p>
+      <w:pPr>
+        <w:spacing w:after="160" w:line="276"/>
+        <w:jc w:val="left"/>
+      </w:pPr>
+      <w:r>
+        <w:rPr>
+          <w:rFonts w:ascii="Times New Roman" w:cs="Times New Roman" w:eastAsia="Times New Roman" w:hAnsi="Times New Roman"/>
+          <w:sz w:val="24"/>
+          <w:szCs w:val="24"/>
+        </w:rPr>
+        <w:t xml:space="preserve">Stowell, D. (2022). Computational bioacoustics with deep learning: a review and roadmap. </w:t>
+      </w:r>
+      <w:r>
+        <w:rPr>
+          <w:rFonts w:ascii="Times New Roman" w:cs="Times New Roman" w:eastAsia="Times New Roman" w:hAnsi="Times New Roman"/>
+          <w:i/>
+          <w:iCs/>
+          <w:sz w:val="24"/>
+          <w:szCs w:val="24"/>
+        </w:rPr>
+        <w:t xml:space="preserve">PeerJ</w:t>
+      </w:r>
+      <w:r>
+        <w:rPr>
+          <w:rFonts w:ascii="Times New Roman" w:cs="Times New Roman" w:eastAsia="Times New Roman" w:hAnsi="Times New Roman"/>
+          <w:sz w:val="24"/>
+          <w:szCs w:val="24"/>
+        </w:rPr>
+        <w:t xml:space="preserve"> 10, e13152. https://doi.org/10.7717/peerj.13152.</w:t>
+      </w:r>
+    </w:p>
+    <w:p>
+      <w:pPr>
+        <w:spacing w:after="160" w:line="276"/>
+        <w:jc w:val="left"/>
+      </w:pPr>
+      <w:r>
+        <w:rPr>
+          <w:rFonts w:ascii="Times New Roman" w:cs="Times New Roman" w:eastAsia="Times New Roman" w:hAnsi="Times New Roman"/>
+          <w:sz w:val="24"/>
+          <w:szCs w:val="24"/>
+        </w:rPr>
+        <w:t xml:space="preserve">Sugai, L.S.M., Silva, T.S.F., Ribeiro, J.W. and Llusia, D. (2019). Terrestrial passive acoustic monitoring: review and perspectives. </w:t>
+      </w:r>
+      <w:r>
+        <w:rPr>
+          <w:rFonts w:ascii="Times New Roman" w:cs="Times New Roman" w:eastAsia="Times New Roman" w:hAnsi="Times New Roman"/>
+          <w:i/>
+          <w:iCs/>
+          <w:sz w:val="24"/>
+          <w:szCs w:val="24"/>
+        </w:rPr>
+        <w:t xml:space="preserve">BioScience</w:t>
+      </w:r>
+      <w:r>
+        <w:rPr>
+          <w:rFonts w:ascii="Times New Roman" w:cs="Times New Roman" w:eastAsia="Times New Roman" w:hAnsi="Times New Roman"/>
+          <w:sz w:val="24"/>
+          <w:szCs w:val="24"/>
+        </w:rPr>
+        <w:t xml:space="preserve"> 69, 15–25.</w:t>
+      </w:r>
+    </w:p>
+    <w:p>
+      <w:pPr>
+        <w:spacing w:after="160" w:line="276"/>
+        <w:jc w:val="left"/>
+      </w:pPr>
+      <w:r>
+        <w:rPr>
+          <w:rFonts w:ascii="Times New Roman" w:cs="Times New Roman" w:eastAsia="Times New Roman" w:hAnsi="Times New Roman"/>
+          <w:sz w:val="24"/>
+          <w:szCs w:val="24"/>
+        </w:rPr>
+        <w:t xml:space="preserve">Tan, M. and Le, Q.V. (2019). EfficientNet: Rethinking model scaling for convolutional neural networks. </w:t>
+      </w:r>
+      <w:r>
+        <w:rPr>
+          <w:rFonts w:ascii="Times New Roman" w:cs="Times New Roman" w:eastAsia="Times New Roman" w:hAnsi="Times New Roman"/>
+          <w:i/>
+          <w:iCs/>
+          <w:sz w:val="24"/>
+          <w:szCs w:val="24"/>
+        </w:rPr>
+        <w:t xml:space="preserve">Proceedings of the 36th International Conference on Machine Learning</w:t>
+      </w:r>
+      <w:r>
+        <w:rPr>
+          <w:rFonts w:ascii="Times New Roman" w:cs="Times New Roman" w:eastAsia="Times New Roman" w:hAnsi="Times New Roman"/>
+          <w:sz w:val="24"/>
+          <w:szCs w:val="24"/>
+        </w:rPr>
+        <w:t xml:space="preserve">, 6105–6114.</w:t>
       </w:r>
     </w:p>
     <w:sectPr>

</xml_diff>

<commit_message>
Audit pass: grammar, factual, and consistency fixes plus required BCI statements
</commit_message>
<xml_diff>
--- a/paper/manuscript.docx
+++ b/paper/manuscript.docx
@@ -75,7 +75,7 @@
           <w:sz w:val="24"/>
           <w:szCs w:val="24"/>
         </w:rPr>
-        <w:t xml:space="preserve">Automated acoustic monitoring is one of the few practical ways to survey rare and cryptic birds, but it depends on software that can recognise the target species, and the global classifiers that power most such monitoring do not cover the species that need it most. Four bird species endemic to India and listed as Endangered or Critically Endangered have sound recordings in public archives, the Forest Owlet, the Banasura Laughingthrush, the Bugun Liocichla, and Jerdon's Courser, yet only the Forest Owlet is recognised by BirdNET, the most widely used bird sound classifier. We gathered every public recording of these four species from the Macaulay Library and Xeno-canto, 193 unique recordings totalling approximately 125 minutes, and tested whether this material is sufficient to train reliable classifiers. Classifiers were trained on acoustic embeddings extracted with BirdNET and were evaluated on a held-out set of recordings that had played no part in training or model tuning. The best classifier identified the correct species for 97.4% of recordings (95% confidence interval 94.8 to 99.5), and its accuracy fell only to 92.2% when the test audio was degraded with synthetic noise as loud as the original recording itself. Because a classifier deployed in the field must also ignore the many species it was never trained on, we further tested the system against 1,891 recordings of 28 other Indian endemic species. By adding a rejection category trained on recordings of other species to the model, we reduce the false positive rate to just 13.4% while still identifying 89.1% of target recordings correctly. As a result, we conclude that reliable classifiers can be developed using publicly available data to aid in the monitoring of endangered birds.</w:t>
+        <w:t xml:space="preserve">Automated acoustic monitoring is one of the few practical ways to survey rare and cryptic birds, but it depends on software that can recognise the target species, and the global classifiers that power most such monitoring do not cover the species that need it most. Four bird species endemic to India and listed as Endangered or Critically Endangered have sound recordings in public archives, the Forest Owlet, the Banasura Laughingthrush, the Bugun Liocichla, and Jerdon's Courser, yet only the Forest Owlet is recognised by BirdNET, the most widely used bird sound classifier. We gathered every public recording of these four species from the Macaulay Library and Xeno-canto, 193 unique recordings totalling approximately 125 minutes, and tested whether this material is sufficient to train reliable classifiers. Classifiers were trained on acoustic embeddings extracted with BirdNET and were evaluated on a held-out set of recordings that had played no part in training or model tuning. The best classifier identified the correct species for 97.4% of recordings (95% confidence interval 94.8 to 99.5), and its accuracy fell only to 92.2% when the test audio was degraded with synthetic noise as loud as the original recording itself. Because a classifier deployed in the field must also ignore the many species it was never trained on, we further tested the system against 1,891 recordings of 28 other Indian endemic species. By adding to the model a rejection category trained on recordings of other species, we reduced the false positive rate to 13.4% while still identifying 89.1% of target recordings correctly. As a result, we conclude that reliable classifiers can be developed using publicly available data to aid in the monitoring of endangered birds.</w:t>
       </w:r>
     </w:p>
     <w:p>
@@ -287,7 +287,7 @@
           <w:sz w:val="24"/>
           <w:szCs w:val="24"/>
         </w:rPr>
-        <w:t xml:space="preserve">These four species are natural candidates for passive acoustic monitoring (Sugai et al. 2019). They are nocturnal or skulking, occupy terrain where visual survey is difficult, and have distinctive vocalisations, and automated recorders have already been deployed to search for one of them, Jerdon's Courser (Arvind et al. 2023). Acoustic monitoring at useful scales, however, requires automated identification, because continuous recorders produce far more audio than observers can review (Gibb et al. 2019). The classifiers that currently dominate applied bioacoustics cannot provide this identification for these species. We verified that only the Forest Owlet is present in the label set of BirdNET V2.4 (Kahl et al. 2021), the most widely used bird song classification system (Pérez-Granados 2023), and the other three species therefore cannot be detected by it at any confidence threshold. As a result, there exists a need for classifiers specifically trained to identify these four species.</w:t>
+        <w:t xml:space="preserve">These four species are natural candidates for passive acoustic monitoring (Sugai et al. 2019). They are elusive, occupy terrain where visual survey is difficult, and have distinctive vocalisations. Automated recorders have already been deployed to search for one of them, Jerdon's Courser (Arvind et al. 2023). Acoustic monitoring at useful scales, however, requires automated identification, because continuous recorders produce far more audio than observers can review (Gibb et al. 2019). The classifiers that currently dominate applied bioacoustics cannot provide this identification for these species. We verified that only the Forest Owlet is present in the label set of BirdNET V2.4 (Kahl et al. 2021), the most widely used bird song classification system (Pérez-Granados 2023), and the other three species therefore cannot be detected by it at any confidence threshold. As a result, there exists a need for classifiers specifically trained to identify these four species.</w:t>
       </w:r>
     </w:p>
     <w:p>
@@ -363,7 +363,7 @@
           <w:sz w:val="24"/>
           <w:szCs w:val="24"/>
         </w:rPr>
-        <w:t xml:space="preserve">We filtered the IUCN Red List for bird species endemic to India and listed as Endangered or Critically Endangered. Seven species qualified, of which the Great Nicobar Serpent Eagle (</w:t>
+        <w:t xml:space="preserve">We filtered the IUCN Red List (IUCN 2025) for bird species endemic to India and listed as Endangered or Critically Endangered. Seven species qualified, of which the Great Nicobar Serpent Eagle (</w:t>
       </w:r>
       <w:r>
         <w:rPr>
@@ -1453,7 +1453,7 @@
           <w:sz w:val="24"/>
           <w:szCs w:val="24"/>
         </w:rPr>
-        <w:t xml:space="preserve">Each recording was decoded to mono 48 kHz audio and segmented into windows of three seconds with 50% overlap, matching the native analysis window commonly used by classifier systems like BirdNET (Kahl et al. 2021). Each window was scored for vocal activity using its spectral energy in the 150 Hz to 11 kHz band relative to the noise floor of its own recording, estimated as the tenth percentile of frame energy. Windows at least 3 dB above the floor were retained, and every recording was guaranteed to contribute at least its highest-scoring window so that no recording dropped out of the dataset (Figure 2).</w:t>
+        <w:t xml:space="preserve">Each recording was decoded to mono 48 kHz audio and segmented into windows of three seconds with 50% overlap, matching the native analysis window commonly used by classifier systems such as BirdNET (Kahl et al. 2021). Each window was scored for vocal activity using its spectral energy in the 150 Hz to 11 kHz band relative to the noise floor of its own recording, estimated as the tenth percentile of frame energy. Windows at least 3 dB above the floor were retained, and every recording was guaranteed to contribute at least its highest-scoring window so that no recording dropped out of the dataset (Figure 2).</w:t>
       </w:r>
     </w:p>
     <w:p>
@@ -1697,7 +1697,7 @@
           <w:sz w:val="24"/>
           <w:szCs w:val="24"/>
         </w:rPr>
-        <w:t xml:space="preserve">The second model classifies foundation model embeddings. Each window was encoded by BirdNET V2.4, with its weights frozen, into a 1,024-dimensional embedding, which is a compact numerical summary of the acoustic content of the window learnt by BirdNET during its training on several thousand species. A two-layer feed-forward network with layer normalisation and dropout classified individual windows, and recording-level predictions were obtained by averaging window probabilities within each recording. We refer to this model as the embedding probe.</w:t>
+        <w:t xml:space="preserve">The second model classifies foundation model embeddings. Each window was encoded by BirdNET V2.4, with its weights frozen, into a 1,024-dimensional embedding, a compact numerical summary of the window's acoustic content learnt during BirdNET's training on several thousand species. A two-layer feed-forward network with layer normalisation and dropout classified individual windows, and recording-level predictions were obtained by averaging window probabilities within each recording. We refer to this model as the embedding probe.</w:t>
       </w:r>
     </w:p>
     <w:p>
@@ -1771,7 +1771,7 @@
           <w:sz w:val="24"/>
           <w:szCs w:val="24"/>
         </w:rPr>
-        <w:t xml:space="preserve">A classifier with four output classes will assign one of those four labels to every input it receives, including recordings of species it has never seen (Scheirer et al. 2013). A model can therefore be highly accurate on the four target species and still be unusable in the field, where most sounds come from other species. We evaluated two approaches to solve this problem, using the 1,891 recordings of the 28 auxiliary species as realistic non-target material.</w:t>
+        <w:t xml:space="preserve">A classifier with four output classes will assign one of those four labels to every input it receives, including recordings of species it has never seen (Scheirer et al. 2013). A model can therefore be highly accurate on the four target species and still be unusable in the field, where most sounds come from other species. We evaluated two approaches to this problem, using the 1,891 recordings of the 28 auxiliary species as realistic non-target material.</w:t>
       </w:r>
     </w:p>
     <w:p>
@@ -1879,7 +1879,7 @@
           <w:sz w:val="24"/>
           <w:szCs w:val="24"/>
         </w:rPr>
-        <w:t xml:space="preserve">Table 2 reports recording-level performance under the primary scheme, and Table 3 reports per-class metrics for the strongest single model. The embedding probe achieved 97.4% accuracy (95% CI 94.8 to 99.5, macro-F1 0.973 with CI 0.938 to 0.996) over all 193 recordings, and the attention-MIL model achieved 96.4% (CI 93.8 to 99.0, macro-F1 0.964). Accuracy varied by at most half a percentage point across seeds for both models. The fine-tuned convolutional network reached 83.4% (CI 77.7 to 88.6, macro-F1 0.826) with roughly four times the seed variance. Exact McNemar tests found the probe clearly superior to the network, with 30 recordings correct only under the probe against three correct only under the network (p = 1.4 × 10⁻⁶), and similarly for the MIL model (29 against four, p = 1.1 × 10⁻⁵), while the probe and the MIL model did not differ significantly from each other (p = 0.69). We attribute the gap to data scale, since roughly 150 training recordings remain too few for end-to-end fine-tuning even with regularisation and augmentation, whereas the frozen embeddings already encode most of the discriminative information.</w:t>
+        <w:t xml:space="preserve">Table 2 reports recording-level performance under the primary scheme, and Table 3 reports per-class metrics for the strongest single model. The embedding probe achieved 97.4% accuracy (95% CI 94.8 to 99.5, macro-F1 0.973 with CI 0.938 to 0.996) over all 193 recordings, and the attention-MIL model achieved 96.4% (CI 93.8 to 99.0, macro-F1 0.964). Accuracy varied by at most half a percentage point across seeds for both models. The fine-tuned convolutional network reached 83.4% (CI 77.7 to 88.6, macro-F1 0.826) with five times the seed variance of the probe. Exact McNemar tests found the probe significantly more accurate than the network, with 30 recordings correct only under the probe against three correct only under the network (p = 1.4 × 10⁻⁶), and similarly for the MIL model (29 against four, p = 1.1 × 10⁻⁵), while the probe and the MIL model did not differ significantly from each other (p = 0.69). We attribute the gap to data scale, since roughly 150 training recordings remain too few for end-to-end fine-tuning even with regularisation and augmentation, whereas the frozen embeddings already encode most of the discriminative information.</w:t>
       </w:r>
     </w:p>
     <w:p>
@@ -5365,21 +5365,21 @@
           <w:sz w:val="28"/>
           <w:szCs w:val="28"/>
         </w:rPr>
-        <w:t xml:space="preserve">Data and code availability</w:t>
-      </w:r>
-    </w:p>
-    <w:p>
-      <w:pPr>
-        <w:spacing w:after="160" w:line="276"/>
-        <w:jc w:val="left"/>
-      </w:pPr>
-      <w:r>
-        <w:rPr>
-          <w:rFonts w:ascii="Times New Roman" w:cs="Times New Roman" w:eastAsia="Times New Roman" w:hAnsi="Times New Roman"/>
-          <w:sz w:val="24"/>
-          <w:szCs w:val="24"/>
-        </w:rPr>
-        <w:t xml:space="preserve">All code, the recording manifest with every Macaulay Library and Xeno-canto catalogue identifier, the split definitions, and the result files are available at https://github.com/srivatsav-kannan/bird-song. Audio is not redistributed, in accordance with archive terms, and the manifest permits exact reconstruction of the dataset from the source archives.</w:t>
+        <w:t xml:space="preserve">Financial support</w:t>
+      </w:r>
+    </w:p>
+    <w:p>
+      <w:pPr>
+        <w:spacing w:after="160" w:line="276"/>
+        <w:jc w:val="left"/>
+      </w:pPr>
+      <w:r>
+        <w:rPr>
+          <w:rFonts w:ascii="Times New Roman" w:cs="Times New Roman" w:eastAsia="Times New Roman" w:hAnsi="Times New Roman"/>
+          <w:sz w:val="24"/>
+          <w:szCs w:val="24"/>
+        </w:rPr>
+        <w:t xml:space="preserve">This research received no specific grant from any funding agency or commercial or not-for-profit sector.</w:t>
       </w:r>
     </w:p>
     <w:p>
@@ -5395,6 +5395,66 @@
           <w:sz w:val="28"/>
           <w:szCs w:val="28"/>
         </w:rPr>
+        <w:t xml:space="preserve">Competing interests</w:t>
+      </w:r>
+    </w:p>
+    <w:p>
+      <w:pPr>
+        <w:spacing w:after="160" w:line="276"/>
+        <w:jc w:val="left"/>
+      </w:pPr>
+      <w:r>
+        <w:rPr>
+          <w:rFonts w:ascii="Times New Roman" w:cs="Times New Roman" w:eastAsia="Times New Roman" w:hAnsi="Times New Roman"/>
+          <w:sz w:val="24"/>
+          <w:szCs w:val="24"/>
+        </w:rPr>
+        <w:t xml:space="preserve">The authors declare none.</w:t>
+      </w:r>
+    </w:p>
+    <w:p>
+      <w:pPr>
+        <w:pStyle w:val="Heading1"/>
+        <w:spacing w:after="160" w:before="280"/>
+      </w:pPr>
+      <w:r>
+        <w:rPr>
+          <w:rFonts w:ascii="Times New Roman" w:cs="Times New Roman" w:eastAsia="Times New Roman" w:hAnsi="Times New Roman"/>
+          <w:b/>
+          <w:bCs/>
+          <w:sz w:val="28"/>
+          <w:szCs w:val="28"/>
+        </w:rPr>
+        <w:t xml:space="preserve">Data and code availability</w:t>
+      </w:r>
+    </w:p>
+    <w:p>
+      <w:pPr>
+        <w:spacing w:after="160" w:line="276"/>
+        <w:jc w:val="left"/>
+      </w:pPr>
+      <w:r>
+        <w:rPr>
+          <w:rFonts w:ascii="Times New Roman" w:cs="Times New Roman" w:eastAsia="Times New Roman" w:hAnsi="Times New Roman"/>
+          <w:sz w:val="24"/>
+          <w:szCs w:val="24"/>
+        </w:rPr>
+        <w:t xml:space="preserve">All code, the recording manifest with every Macaulay Library and Xeno-canto catalogue identifier, the split definitions, and the result files are available at https://github.com/srivatsav-kannan/bird-song. Audio is not redistributed, in accordance with archive terms, and the manifest permits exact reconstruction of the dataset from the source archives.</w:t>
+      </w:r>
+    </w:p>
+    <w:p>
+      <w:pPr>
+        <w:pStyle w:val="Heading1"/>
+        <w:spacing w:after="160" w:before="280"/>
+      </w:pPr>
+      <w:r>
+        <w:rPr>
+          <w:rFonts w:ascii="Times New Roman" w:cs="Times New Roman" w:eastAsia="Times New Roman" w:hAnsi="Times New Roman"/>
+          <w:b/>
+          <w:bCs/>
+          <w:sz w:val="28"/>
+          <w:szCs w:val="28"/>
+        </w:rPr>
         <w:t xml:space="preserve">References</w:t>
       </w:r>
     </w:p>
@@ -5683,7 +5743,7 @@
           <w:sz w:val="24"/>
           <w:szCs w:val="24"/>
         </w:rPr>
-        <w:t xml:space="preserve">. https://www.iucnredlist.org (accessed 2026).</w:t>
+        <w:t xml:space="preserve">. https://www.iucnredlist.org (accessed 26 August 2026).</w:t>
       </w:r>
     </w:p>
     <w:p>
@@ -5985,7 +6045,7 @@
           <w:sz w:val="24"/>
           <w:szCs w:val="24"/>
         </w:rPr>
-        <w:t xml:space="preserve">Search for Lost Birds (2025). Jerdon's Courser. https://searchforlostbirds.org/birds/jerdons-courser (accessed 2026).</w:t>
+        <w:t xml:space="preserve">Search for Lost Birds (2025). Jerdon's Courser. https://searchforlostbirds.org/birds/jerdons-courser (accessed 26 August 2026).</w:t>
       </w:r>
     </w:p>
     <w:p>

</xml_diff>

<commit_message>
Restore the false-positive baseline in the Summary, plain wording for range countries
</commit_message>
<xml_diff>
--- a/paper/manuscript.docx
+++ b/paper/manuscript.docx
@@ -75,7 +75,7 @@
           <w:sz w:val="24"/>
           <w:szCs w:val="24"/>
         </w:rPr>
-        <w:t xml:space="preserve">Automated acoustic monitoring is one of the few practical ways to survey rare and cryptic birds, but it depends on software that can recognise the target species, and the global classifiers that power most such monitoring do not cover the species that need it most. Four bird species endemic to India and listed as Endangered or Critically Endangered have sound recordings in public archives, the Forest Owlet, the Banasura Laughingthrush, the Bugun Liocichla, and Jerdon's Courser, yet only the Forest Owlet is recognised by BirdNET, the most widely used bird sound classifier. We gathered every public recording of these four species from the Macaulay Library and Xeno-canto, 193 unique recordings totalling approximately 125 minutes, and tested whether this material is sufficient to train reliable classifiers. Classifiers were trained on acoustic embeddings extracted with BirdNET and were evaluated on a held-out set of recordings that had played no part in training or model tuning. The best classifier identified the correct species for 97.4% of recordings (95% confidence interval 94.8 to 99.5), and its accuracy fell only to 92.2% when the test audio was degraded with synthetic noise as loud as the original recording itself. Because a classifier deployed in the field must also ignore the many species it was never trained on, we further tested the system against 1,891 recordings of 28 other Indian endemic species. By adding to the model a rejection category trained on recordings of other species, we reduced the false positive rate to 13.4% while still identifying 89.1% of target recordings correctly. As a result, we conclude that reliable classifiers can be developed using publicly available data to aid in the monitoring of endangered birds.</w:t>
+        <w:t xml:space="preserve">Automated acoustic monitoring is one of the few practical ways to survey rare and cryptic birds, but it depends on software that can recognise the target species, and the global classifiers that power most such monitoring do not cover the species that need it most. Four bird species endemic to India and listed as Endangered or Critically Endangered have sound recordings in public archives, the Forest Owlet, the Banasura Laughingthrush, the Bugun Liocichla, and Jerdon's Courser, yet only the Forest Owlet is recognised by BirdNET, the most widely used bird sound classifier. We gathered every public recording of these four species from the Macaulay Library and Xeno-canto, 193 unique recordings totalling approximately 125 minutes, and tested whether this material is sufficient to train reliable classifiers. Classifiers were trained on acoustic embeddings extracted with BirdNET and were evaluated on a held-out set of recordings that had played no part in training or model tuning. The best classifier identified the correct species for 97.4% of recordings (95% confidence interval 94.8 to 99.5), and its accuracy fell only to 92.2% when the test audio was degraded with synthetic noise as loud as the original recording itself. Because a classifier deployed in the field must also ignore the many species it was never trained on, we further tested the system against 1,891 recordings of 28 other Indian endemic species, of which 93.7% were wrongly accepted as target species. By adding to the model a rejection category trained on recordings of other species, we reduced this false positive rate to 13.4% while still identifying 89.1% of target recordings correctly. As a result, we conclude that reliable classifiers can be developed using publicly available data to aid in the monitoring of endangered birds.</w:t>
       </w:r>
     </w:p>
     <w:p>
@@ -5219,7 +5219,7 @@
           <w:sz w:val="24"/>
           <w:szCs w:val="24"/>
         </w:rPr>
-        <w:t xml:space="preserve">The central result is that the complete public acoustic record of India's four most threatened endemic birds, small as it is, supports accurate automated identification when the representation and the evaluation are chosen carefully. Frozen embeddings from a large pretrained bird sound model, with a lightweight classifier trained on a laptop in minutes, reached 97.4% recording-level accuracy and outperformed an end-to-end fine-tuned network by 14 percentage points, and the advantage grew under the stricter session-level evaluation. This extends the evidence in Ghani et al. (2023) to an unusually data-poor, conservation-critical setting, and it carries a practical message for range-country institutions, which can build detectors for nationally important species with modest computation instead of waiting for global model updates.</w:t>
+        <w:t xml:space="preserve">The central result is that the complete public acoustic record of India's four most threatened endemic birds, small as it is, supports accurate automated identification when the representation and the evaluation are chosen carefully. Frozen embeddings from a large pretrained bird sound model, with a lightweight classifier trained on a laptop in minutes, reached 97.4% recording-level accuracy and outperformed an end-to-end fine-tuned network by 14 percentage points, and the advantage grew under the stricter session-level evaluation. This extends the evidence in Ghani et al. (2023) to an unusually data-poor, conservation-critical setting, and it carries a practical message for institutions in the species' range countries, which can build detectors for nationally important species with modest computation instead of waiting for global model updates.</w:t>
       </w:r>
     </w:p>
     <w:p>

</xml_diff>